<commit_message>
update Simpulan 14 Juni 2021
</commit_message>
<xml_diff>
--- a/Files/Jurnal_out/33425-79483-1-RV.docx
+++ b/Files/Jurnal_out/33425-79483-1-RV.docx
@@ -10320,7 +10320,7 @@
               <w:rPr>
                 <w:noProof/>
               </w:rPr>
-              <w:object w:dxaOrig="10095" w:dyaOrig="15466" w14:anchorId="0E705C53">
+              <w:object w:dxaOrig="10095" w:dyaOrig="15466" w14:anchorId="5BA3B306">
                 <v:shapetype id="_x0000_t75" coordsize="21600,21600" o:spt="75" o:preferrelative="t" path="m@4@5l@4@11@9@11@9@5xe" filled="f" stroked="f">
                   <v:stroke joinstyle="miter"/>
                   <v:formulas>
@@ -10343,7 +10343,7 @@
                 <v:shape id="_x0000_i1030" type="#_x0000_t75" alt="" style="width:299.1pt;height:459.15pt;mso-width-percent:0;mso-height-percent:0;mso-width-percent:0;mso-height-percent:0" o:ole="">
                   <v:imagedata r:id="rId16" o:title=""/>
                 </v:shape>
-                <o:OLEObject Type="Embed" ProgID="Visio.Drawing.15" ShapeID="_x0000_i1030" DrawAspect="Content" ObjectID="_1685010501" r:id="rId17"/>
+                <o:OLEObject Type="Embed" ProgID="Visio.Drawing.15" ShapeID="_x0000_i1030" DrawAspect="Content" ObjectID="_1685184882" r:id="rId17"/>
               </w:object>
             </w:r>
           </w:p>
@@ -11150,11 +11150,11 @@
               <w:rPr>
                 <w:noProof/>
               </w:rPr>
-              <w:object w:dxaOrig="6526" w:dyaOrig="7621" w14:anchorId="0DD2BA21">
+              <w:object w:dxaOrig="6526" w:dyaOrig="7621" w14:anchorId="13269122">
                 <v:shape id="_x0000_i1029" type="#_x0000_t75" alt="" style="width:229.3pt;height:269.15pt;mso-width-percent:0;mso-height-percent:0;mso-width-percent:0;mso-height-percent:0" o:ole="">
                   <v:imagedata r:id="rId18" o:title=""/>
                 </v:shape>
-                <o:OLEObject Type="Embed" ProgID="Visio.Drawing.15" ShapeID="_x0000_i1029" DrawAspect="Content" ObjectID="_1685010502" r:id="rId19"/>
+                <o:OLEObject Type="Embed" ProgID="Visio.Drawing.15" ShapeID="_x0000_i1029" DrawAspect="Content" ObjectID="_1685184883" r:id="rId19"/>
               </w:object>
             </w:r>
           </w:p>
@@ -11266,11 +11266,11 @@
               <w:rPr>
                 <w:noProof/>
               </w:rPr>
-              <w:object w:dxaOrig="7695" w:dyaOrig="4741" w14:anchorId="3258B2C2">
+              <w:object w:dxaOrig="7695" w:dyaOrig="4741" w14:anchorId="206D56FA">
                 <v:shape id="_x0000_i1028" type="#_x0000_t75" alt="" style="width:212.1pt;height:116.85pt;mso-width-percent:0;mso-height-percent:0;mso-width-percent:0;mso-height-percent:0" o:ole="">
                   <v:imagedata r:id="rId20" o:title=""/>
                 </v:shape>
-                <o:OLEObject Type="Embed" ProgID="Visio.Drawing.15" ShapeID="_x0000_i1028" DrawAspect="Content" ObjectID="_1685010503" r:id="rId21"/>
+                <o:OLEObject Type="Embed" ProgID="Visio.Drawing.15" ShapeID="_x0000_i1028" DrawAspect="Content" ObjectID="_1685184884" r:id="rId21"/>
               </w:object>
             </w:r>
           </w:p>
@@ -11291,11 +11291,11 @@
               <w:rPr>
                 <w:noProof/>
               </w:rPr>
-              <w:object w:dxaOrig="7786" w:dyaOrig="6720" w14:anchorId="126373D4">
+              <w:object w:dxaOrig="7786" w:dyaOrig="6720" w14:anchorId="419F5445">
                 <v:shape id="_x0000_i1027" type="#_x0000_t75" alt="" style="width:186.1pt;height:127.95pt;mso-width-percent:0;mso-height-percent:0;mso-width-percent:0;mso-height-percent:0" o:ole="">
                   <v:imagedata r:id="rId22" o:title=""/>
                 </v:shape>
-                <o:OLEObject Type="Embed" ProgID="Visio.Drawing.15" ShapeID="_x0000_i1027" DrawAspect="Content" ObjectID="_1685010504" r:id="rId23"/>
+                <o:OLEObject Type="Embed" ProgID="Visio.Drawing.15" ShapeID="_x0000_i1027" DrawAspect="Content" ObjectID="_1685184885" r:id="rId23"/>
               </w:object>
             </w:r>
           </w:p>
@@ -11752,11 +11752,11 @@
               <w:rPr>
                 <w:noProof/>
               </w:rPr>
-              <w:object w:dxaOrig="5761" w:dyaOrig="8821" w14:anchorId="24EA52D0">
+              <w:object w:dxaOrig="5761" w:dyaOrig="8821" w14:anchorId="7704ADE3">
                 <v:shape id="_x0000_i1026" type="#_x0000_t75" alt="" style="width:152.3pt;height:232.05pt;mso-width-percent:0;mso-height-percent:0;mso-width-percent:0;mso-height-percent:0" o:ole="">
                   <v:imagedata r:id="rId24" o:title=""/>
                 </v:shape>
-                <o:OLEObject Type="Embed" ProgID="Visio.Drawing.15" ShapeID="_x0000_i1026" DrawAspect="Content" ObjectID="_1685010505" r:id="rId25"/>
+                <o:OLEObject Type="Embed" ProgID="Visio.Drawing.15" ShapeID="_x0000_i1026" DrawAspect="Content" ObjectID="_1685184886" r:id="rId25"/>
               </w:object>
             </w:r>
           </w:p>
@@ -11780,11 +11780,11 @@
               <w:rPr>
                 <w:noProof/>
               </w:rPr>
-              <w:object w:dxaOrig="5670" w:dyaOrig="12136" w14:anchorId="5FAD5814">
+              <w:object w:dxaOrig="5670" w:dyaOrig="12136" w14:anchorId="1653260E">
                 <v:shape id="_x0000_i1025" type="#_x0000_t75" alt="" style="width:135.15pt;height:230.95pt;mso-width-percent:0;mso-height-percent:0;mso-width-percent:0;mso-height-percent:0" o:ole="">
                   <v:imagedata r:id="rId26" o:title=""/>
                 </v:shape>
-                <o:OLEObject Type="Embed" ProgID="Visio.Drawing.15" ShapeID="_x0000_i1025" DrawAspect="Content" ObjectID="_1685010506" r:id="rId27"/>
+                <o:OLEObject Type="Embed" ProgID="Visio.Drawing.15" ShapeID="_x0000_i1025" DrawAspect="Content" ObjectID="_1685184887" r:id="rId27"/>
               </w:object>
             </w:r>
           </w:p>
@@ -12839,6 +12839,7 @@
           <w:bCs/>
           <w:color w:val="000000"/>
           <w:spacing w:val="-6"/>
+          <w:lang w:val="en-US"/>
         </w:rPr>
       </w:pPr>
       <w:r>
@@ -12889,6 +12890,39 @@
           <w:spacing w:val="-6"/>
         </w:rPr>
         <w:t xml:space="preserve"> </w:t>
+      </w:r>
+      <w:r>
+        <w:rPr>
+          <w:rFonts w:ascii="Arial" w:hAnsi="Arial" w:cs="Arial"/>
+          <w:b/>
+          <w:bCs/>
+          <w:color w:val="000000"/>
+          <w:spacing w:val="-6"/>
+          <w:lang w:val="en-US"/>
+        </w:rPr>
+        <w:t>DAN PEMBA</w:t>
+      </w:r>
+      <w:r>
+        <w:rPr>
+          <w:rFonts w:ascii="Arial" w:hAnsi="Arial" w:cs="Arial"/>
+          <w:b/>
+          <w:bCs/>
+          <w:color w:val="000000"/>
+          <w:spacing w:val="-6"/>
+          <w:lang w:val="en-US"/>
+        </w:rPr>
+        <w:t>H</w:t>
+      </w:r>
+      <w:r>
+        <w:rPr>
+          <w:rFonts w:ascii="Arial" w:hAnsi="Arial" w:cs="Arial"/>
+          <w:b/>
+          <w:bCs/>
+          <w:color w:val="000000"/>
+          <w:spacing w:val="-6"/>
+          <w:lang w:val="en-US"/>
+        </w:rPr>
+        <w:t>ASAN</w:t>
       </w:r>
     </w:p>
     <w:p>
@@ -21810,7 +21844,14 @@
           <w:rFonts w:ascii="Arial" w:hAnsi="Arial" w:cs="Arial"/>
           <w:spacing w:val="-1"/>
         </w:rPr>
-        <w:t xml:space="preserve"> Li-Ion ukuran 18650 dengan voltase 3.7 – 4.2 volt</w:t>
+        <w:t xml:space="preserve"> Li-Ion </w:t>
+      </w:r>
+      <w:r>
+        <w:rPr>
+          <w:rFonts w:ascii="Arial" w:hAnsi="Arial" w:cs="Arial"/>
+          <w:spacing w:val="-1"/>
+        </w:rPr>
+        <w:t>ukuran 18650 dengan voltase 3.7 – 4.2 volt</w:t>
       </w:r>
       <w:r>
         <w:rPr>
@@ -22039,10 +22080,13 @@
     <w:p>
       <w:pPr>
         <w:spacing w:after="0" w:line="240" w:lineRule="auto"/>
+        <w:ind w:firstLine="547"/>
         <w:contextualSpacing/>
         <w:jc w:val="both"/>
         <w:rPr>
           <w:rFonts w:ascii="Arial" w:hAnsi="Arial" w:cs="Arial"/>
+          <w:spacing w:val="-1"/>
+          <w:lang w:val="en-US"/>
         </w:rPr>
         <w:sectPr>
           <w:type w:val="continuous"/>
@@ -22052,6 +22096,752 @@
           <w:noEndnote/>
         </w:sectPr>
       </w:pPr>
+      <w:r>
+        <w:rPr>
+          <w:rFonts w:ascii="Arial" w:hAnsi="Arial" w:cs="Arial"/>
+          <w:spacing w:val="-1"/>
+          <w:lang w:val="en-US"/>
+        </w:rPr>
+        <w:t xml:space="preserve">Pada system </w:t>
+      </w:r>
+      <w:proofErr w:type="spellStart"/>
+      <w:r>
+        <w:rPr>
+          <w:rFonts w:ascii="Arial" w:hAnsi="Arial" w:cs="Arial"/>
+          <w:spacing w:val="-1"/>
+          <w:lang w:val="en-US"/>
+        </w:rPr>
+        <w:t>ini</w:t>
+      </w:r>
+      <w:proofErr w:type="spellEnd"/>
+      <w:r>
+        <w:rPr>
+          <w:rFonts w:ascii="Arial" w:hAnsi="Arial" w:cs="Arial"/>
+          <w:spacing w:val="-1"/>
+          <w:lang w:val="en-US"/>
+        </w:rPr>
+        <w:t xml:space="preserve"> </w:t>
+      </w:r>
+      <w:proofErr w:type="spellStart"/>
+      <w:r>
+        <w:rPr>
+          <w:rFonts w:ascii="Arial" w:hAnsi="Arial" w:cs="Arial"/>
+          <w:spacing w:val="-1"/>
+          <w:lang w:val="en-US"/>
+        </w:rPr>
+        <w:t>memiliki</w:t>
+      </w:r>
+      <w:proofErr w:type="spellEnd"/>
+      <w:r>
+        <w:rPr>
+          <w:rFonts w:ascii="Arial" w:hAnsi="Arial" w:cs="Arial"/>
+          <w:spacing w:val="-1"/>
+          <w:lang w:val="en-US"/>
+        </w:rPr>
+        <w:t xml:space="preserve"> </w:t>
+      </w:r>
+      <w:proofErr w:type="spellStart"/>
+      <w:r>
+        <w:rPr>
+          <w:rFonts w:ascii="Arial" w:hAnsi="Arial" w:cs="Arial"/>
+          <w:spacing w:val="-1"/>
+          <w:lang w:val="en-US"/>
+        </w:rPr>
+        <w:t>kekurangan</w:t>
+      </w:r>
+      <w:proofErr w:type="spellEnd"/>
+      <w:r>
+        <w:rPr>
+          <w:rFonts w:ascii="Arial" w:hAnsi="Arial" w:cs="Arial"/>
+          <w:spacing w:val="-1"/>
+          <w:lang w:val="en-US"/>
+        </w:rPr>
+        <w:t xml:space="preserve"> </w:t>
+      </w:r>
+      <w:proofErr w:type="spellStart"/>
+      <w:r>
+        <w:rPr>
+          <w:rFonts w:ascii="Arial" w:hAnsi="Arial" w:cs="Arial"/>
+          <w:spacing w:val="-1"/>
+          <w:lang w:val="en-US"/>
+        </w:rPr>
+        <w:t>dimana</w:t>
+      </w:r>
+      <w:proofErr w:type="spellEnd"/>
+      <w:r>
+        <w:rPr>
+          <w:rFonts w:ascii="Arial" w:hAnsi="Arial" w:cs="Arial"/>
+          <w:spacing w:val="-1"/>
+          <w:lang w:val="en-US"/>
+        </w:rPr>
+        <w:t xml:space="preserve"> </w:t>
+      </w:r>
+      <w:proofErr w:type="spellStart"/>
+      <w:r>
+        <w:rPr>
+          <w:rFonts w:ascii="Arial" w:hAnsi="Arial" w:cs="Arial"/>
+          <w:spacing w:val="-1"/>
+          <w:lang w:val="en-US"/>
+        </w:rPr>
+        <w:t>membutuhkan</w:t>
+      </w:r>
+      <w:proofErr w:type="spellEnd"/>
+      <w:r>
+        <w:rPr>
+          <w:rFonts w:ascii="Arial" w:hAnsi="Arial" w:cs="Arial"/>
+          <w:spacing w:val="-1"/>
+          <w:lang w:val="en-US"/>
+        </w:rPr>
+        <w:t xml:space="preserve"> </w:t>
+      </w:r>
+      <w:proofErr w:type="spellStart"/>
+      <w:r>
+        <w:rPr>
+          <w:rFonts w:ascii="Arial" w:hAnsi="Arial" w:cs="Arial"/>
+          <w:spacing w:val="-1"/>
+          <w:lang w:val="en-US"/>
+        </w:rPr>
+        <w:t>koneksi</w:t>
+      </w:r>
+      <w:proofErr w:type="spellEnd"/>
+      <w:r>
+        <w:rPr>
+          <w:rFonts w:ascii="Arial" w:hAnsi="Arial" w:cs="Arial"/>
+          <w:spacing w:val="-1"/>
+          <w:lang w:val="en-US"/>
+        </w:rPr>
+        <w:t xml:space="preserve"> internet </w:t>
+      </w:r>
+      <w:proofErr w:type="spellStart"/>
+      <w:r>
+        <w:rPr>
+          <w:rFonts w:ascii="Arial" w:hAnsi="Arial" w:cs="Arial"/>
+          <w:spacing w:val="-1"/>
+          <w:lang w:val="en-US"/>
+        </w:rPr>
+        <w:t>untuk</w:t>
+      </w:r>
+      <w:proofErr w:type="spellEnd"/>
+      <w:r>
+        <w:rPr>
+          <w:rFonts w:ascii="Arial" w:hAnsi="Arial" w:cs="Arial"/>
+          <w:spacing w:val="-1"/>
+          <w:lang w:val="en-US"/>
+        </w:rPr>
+        <w:t xml:space="preserve"> </w:t>
+      </w:r>
+      <w:proofErr w:type="spellStart"/>
+      <w:r>
+        <w:rPr>
+          <w:rFonts w:ascii="Arial" w:hAnsi="Arial" w:cs="Arial"/>
+          <w:spacing w:val="-1"/>
+          <w:lang w:val="en-US"/>
+        </w:rPr>
+        <w:t>melakukan</w:t>
+      </w:r>
+      <w:proofErr w:type="spellEnd"/>
+      <w:r>
+        <w:rPr>
+          <w:rFonts w:ascii="Arial" w:hAnsi="Arial" w:cs="Arial"/>
+          <w:spacing w:val="-1"/>
+          <w:lang w:val="en-US"/>
+        </w:rPr>
+        <w:t xml:space="preserve"> </w:t>
+      </w:r>
+      <w:proofErr w:type="spellStart"/>
+      <w:r>
+        <w:rPr>
+          <w:rFonts w:ascii="Arial" w:hAnsi="Arial" w:cs="Arial"/>
+          <w:spacing w:val="-1"/>
+          <w:lang w:val="en-US"/>
+        </w:rPr>
+        <w:t>komunikasi</w:t>
+      </w:r>
+      <w:proofErr w:type="spellEnd"/>
+      <w:r>
+        <w:rPr>
+          <w:rFonts w:ascii="Arial" w:hAnsi="Arial" w:cs="Arial"/>
+          <w:spacing w:val="-1"/>
+          <w:lang w:val="en-US"/>
+        </w:rPr>
+        <w:t xml:space="preserve"> </w:t>
+      </w:r>
+      <w:proofErr w:type="spellStart"/>
+      <w:r>
+        <w:rPr>
+          <w:rFonts w:ascii="Arial" w:hAnsi="Arial" w:cs="Arial"/>
+          <w:spacing w:val="-1"/>
+          <w:lang w:val="en-US"/>
+        </w:rPr>
+        <w:t>antar</w:t>
+      </w:r>
+      <w:proofErr w:type="spellEnd"/>
+      <w:r>
+        <w:rPr>
+          <w:rFonts w:ascii="Arial" w:hAnsi="Arial" w:cs="Arial"/>
+          <w:spacing w:val="-1"/>
+          <w:lang w:val="en-US"/>
+        </w:rPr>
+        <w:t xml:space="preserve"> </w:t>
+      </w:r>
+      <w:proofErr w:type="spellStart"/>
+      <w:r>
+        <w:rPr>
+          <w:rFonts w:ascii="Arial" w:hAnsi="Arial" w:cs="Arial"/>
+          <w:spacing w:val="-1"/>
+          <w:lang w:val="en-US"/>
+        </w:rPr>
+        <w:t>perangkat</w:t>
+      </w:r>
+      <w:proofErr w:type="spellEnd"/>
+      <w:r>
+        <w:rPr>
+          <w:rFonts w:ascii="Arial" w:hAnsi="Arial" w:cs="Arial"/>
+          <w:spacing w:val="-1"/>
+          <w:lang w:val="en-US"/>
+        </w:rPr>
+        <w:t xml:space="preserve">, Adapun saran </w:t>
+      </w:r>
+      <w:proofErr w:type="spellStart"/>
+      <w:r>
+        <w:rPr>
+          <w:rFonts w:ascii="Arial" w:hAnsi="Arial" w:cs="Arial"/>
+          <w:spacing w:val="-1"/>
+          <w:lang w:val="en-US"/>
+        </w:rPr>
+        <w:t>untuk</w:t>
+      </w:r>
+      <w:proofErr w:type="spellEnd"/>
+      <w:r>
+        <w:rPr>
+          <w:rFonts w:ascii="Arial" w:hAnsi="Arial" w:cs="Arial"/>
+          <w:spacing w:val="-1"/>
+          <w:lang w:val="en-US"/>
+        </w:rPr>
+        <w:t xml:space="preserve"> </w:t>
+      </w:r>
+      <w:proofErr w:type="spellStart"/>
+      <w:r>
+        <w:rPr>
+          <w:rFonts w:ascii="Arial" w:hAnsi="Arial" w:cs="Arial"/>
+          <w:spacing w:val="-1"/>
+          <w:lang w:val="en-US"/>
+        </w:rPr>
+        <w:t>pengembangan</w:t>
+      </w:r>
+      <w:proofErr w:type="spellEnd"/>
+      <w:r>
+        <w:rPr>
+          <w:rFonts w:ascii="Arial" w:hAnsi="Arial" w:cs="Arial"/>
+          <w:spacing w:val="-1"/>
+          <w:lang w:val="en-US"/>
+        </w:rPr>
+        <w:t xml:space="preserve"> </w:t>
+      </w:r>
+      <w:proofErr w:type="spellStart"/>
+      <w:r>
+        <w:rPr>
+          <w:rFonts w:ascii="Arial" w:hAnsi="Arial" w:cs="Arial"/>
+          <w:spacing w:val="-1"/>
+          <w:lang w:val="en-US"/>
+        </w:rPr>
+        <w:t>berikutnya</w:t>
+      </w:r>
+      <w:proofErr w:type="spellEnd"/>
+      <w:r>
+        <w:rPr>
+          <w:rFonts w:ascii="Arial" w:hAnsi="Arial" w:cs="Arial"/>
+          <w:spacing w:val="-1"/>
+          <w:lang w:val="en-US"/>
+        </w:rPr>
+        <w:t xml:space="preserve"> </w:t>
+      </w:r>
+      <w:proofErr w:type="spellStart"/>
+      <w:r>
+        <w:rPr>
+          <w:rFonts w:ascii="Arial" w:hAnsi="Arial" w:cs="Arial"/>
+          <w:spacing w:val="-1"/>
+          <w:lang w:val="en-US"/>
+        </w:rPr>
+        <w:t>dengan</w:t>
+      </w:r>
+      <w:proofErr w:type="spellEnd"/>
+      <w:r>
+        <w:rPr>
+          <w:rFonts w:ascii="Arial" w:hAnsi="Arial" w:cs="Arial"/>
+          <w:spacing w:val="-1"/>
+          <w:lang w:val="en-US"/>
+        </w:rPr>
+        <w:t xml:space="preserve"> </w:t>
+      </w:r>
+      <w:proofErr w:type="spellStart"/>
+      <w:r>
+        <w:rPr>
+          <w:rFonts w:ascii="Arial" w:hAnsi="Arial" w:cs="Arial"/>
+          <w:spacing w:val="-1"/>
+          <w:lang w:val="en-US"/>
+        </w:rPr>
+        <w:t>menambahkan</w:t>
+      </w:r>
+      <w:proofErr w:type="spellEnd"/>
+      <w:r>
+        <w:rPr>
+          <w:rFonts w:ascii="Arial" w:hAnsi="Arial" w:cs="Arial"/>
+          <w:spacing w:val="-1"/>
+          <w:lang w:val="en-US"/>
+        </w:rPr>
+        <w:t xml:space="preserve"> </w:t>
+      </w:r>
+      <w:proofErr w:type="spellStart"/>
+      <w:r>
+        <w:rPr>
+          <w:rFonts w:ascii="Arial" w:hAnsi="Arial" w:cs="Arial"/>
+          <w:spacing w:val="-1"/>
+          <w:lang w:val="en-US"/>
+        </w:rPr>
+        <w:t>komunikasi</w:t>
+      </w:r>
+      <w:proofErr w:type="spellEnd"/>
+      <w:r>
+        <w:rPr>
+          <w:rFonts w:ascii="Arial" w:hAnsi="Arial" w:cs="Arial"/>
+          <w:spacing w:val="-1"/>
+          <w:lang w:val="en-US"/>
+        </w:rPr>
+        <w:t xml:space="preserve"> </w:t>
+      </w:r>
+      <w:proofErr w:type="spellStart"/>
+      <w:r>
+        <w:rPr>
+          <w:rFonts w:ascii="Arial" w:hAnsi="Arial" w:cs="Arial"/>
+          <w:spacing w:val="-1"/>
+          <w:lang w:val="en-US"/>
+        </w:rPr>
+        <w:t>menggunakan</w:t>
+      </w:r>
+      <w:proofErr w:type="spellEnd"/>
+      <w:r>
+        <w:rPr>
+          <w:rFonts w:ascii="Arial" w:hAnsi="Arial" w:cs="Arial"/>
+          <w:spacing w:val="-1"/>
+          <w:lang w:val="en-US"/>
+        </w:rPr>
+        <w:t xml:space="preserve"> SMS Gateway </w:t>
+      </w:r>
+      <w:proofErr w:type="spellStart"/>
+      <w:r>
+        <w:rPr>
+          <w:rFonts w:ascii="Arial" w:hAnsi="Arial" w:cs="Arial"/>
+          <w:spacing w:val="-1"/>
+          <w:lang w:val="en-US"/>
+        </w:rPr>
+        <w:t>sebagai</w:t>
+      </w:r>
+      <w:proofErr w:type="spellEnd"/>
+      <w:r>
+        <w:rPr>
+          <w:rFonts w:ascii="Arial" w:hAnsi="Arial" w:cs="Arial"/>
+          <w:spacing w:val="-1"/>
+          <w:lang w:val="en-US"/>
+        </w:rPr>
+        <w:t xml:space="preserve"> </w:t>
+      </w:r>
+      <w:proofErr w:type="spellStart"/>
+      <w:r>
+        <w:rPr>
+          <w:rFonts w:ascii="Arial" w:hAnsi="Arial" w:cs="Arial"/>
+          <w:spacing w:val="-1"/>
+          <w:lang w:val="en-US"/>
+        </w:rPr>
+        <w:t>alternatif</w:t>
+      </w:r>
+      <w:proofErr w:type="spellEnd"/>
+      <w:r>
+        <w:rPr>
+          <w:rFonts w:ascii="Arial" w:hAnsi="Arial" w:cs="Arial"/>
+          <w:spacing w:val="-1"/>
+          <w:lang w:val="en-US"/>
+        </w:rPr>
+        <w:t xml:space="preserve"> </w:t>
+      </w:r>
+      <w:proofErr w:type="spellStart"/>
+      <w:r>
+        <w:rPr>
+          <w:rFonts w:ascii="Arial" w:hAnsi="Arial" w:cs="Arial"/>
+          <w:spacing w:val="-1"/>
+          <w:lang w:val="en-US"/>
+        </w:rPr>
+        <w:t>jika</w:t>
+      </w:r>
+      <w:proofErr w:type="spellEnd"/>
+      <w:r>
+        <w:rPr>
+          <w:rFonts w:ascii="Arial" w:hAnsi="Arial" w:cs="Arial"/>
+          <w:spacing w:val="-1"/>
+          <w:lang w:val="en-US"/>
+        </w:rPr>
+        <w:t xml:space="preserve"> </w:t>
+      </w:r>
+      <w:proofErr w:type="spellStart"/>
+      <w:r>
+        <w:rPr>
+          <w:rFonts w:ascii="Arial" w:hAnsi="Arial" w:cs="Arial"/>
+          <w:spacing w:val="-1"/>
+          <w:lang w:val="en-US"/>
+        </w:rPr>
+        <w:t>tidak</w:t>
+      </w:r>
+      <w:proofErr w:type="spellEnd"/>
+      <w:r>
+        <w:rPr>
+          <w:rFonts w:ascii="Arial" w:hAnsi="Arial" w:cs="Arial"/>
+          <w:spacing w:val="-1"/>
+          <w:lang w:val="en-US"/>
+        </w:rPr>
+        <w:t xml:space="preserve"> </w:t>
+      </w:r>
+      <w:proofErr w:type="spellStart"/>
+      <w:r>
+        <w:rPr>
+          <w:rFonts w:ascii="Arial" w:hAnsi="Arial" w:cs="Arial"/>
+          <w:spacing w:val="-1"/>
+          <w:lang w:val="en-US"/>
+        </w:rPr>
+        <w:t>memiliki</w:t>
+      </w:r>
+      <w:proofErr w:type="spellEnd"/>
+      <w:r>
+        <w:rPr>
+          <w:rFonts w:ascii="Arial" w:hAnsi="Arial" w:cs="Arial"/>
+          <w:spacing w:val="-1"/>
+          <w:lang w:val="en-US"/>
+        </w:rPr>
+        <w:t xml:space="preserve"> </w:t>
+      </w:r>
+      <w:proofErr w:type="spellStart"/>
+      <w:r>
+        <w:rPr>
+          <w:rFonts w:ascii="Arial" w:hAnsi="Arial" w:cs="Arial"/>
+          <w:spacing w:val="-1"/>
+          <w:lang w:val="en-US"/>
+        </w:rPr>
+        <w:t>koneksi</w:t>
+      </w:r>
+      <w:proofErr w:type="spellEnd"/>
+      <w:r>
+        <w:rPr>
+          <w:rFonts w:ascii="Arial" w:hAnsi="Arial" w:cs="Arial"/>
+          <w:spacing w:val="-1"/>
+          <w:lang w:val="en-US"/>
+        </w:rPr>
+        <w:t xml:space="preserve"> internet. </w:t>
+      </w:r>
+      <w:proofErr w:type="spellStart"/>
+      <w:r>
+        <w:rPr>
+          <w:rFonts w:ascii="Arial" w:hAnsi="Arial" w:cs="Arial"/>
+          <w:spacing w:val="-1"/>
+          <w:lang w:val="en-US"/>
+        </w:rPr>
+        <w:t>Penambahan</w:t>
+      </w:r>
+      <w:proofErr w:type="spellEnd"/>
+      <w:r>
+        <w:rPr>
+          <w:rFonts w:ascii="Arial" w:hAnsi="Arial" w:cs="Arial"/>
+          <w:spacing w:val="-1"/>
+          <w:lang w:val="en-US"/>
+        </w:rPr>
+        <w:t xml:space="preserve"> zona radius juga </w:t>
+      </w:r>
+      <w:proofErr w:type="spellStart"/>
+      <w:r>
+        <w:rPr>
+          <w:rFonts w:ascii="Arial" w:hAnsi="Arial" w:cs="Arial"/>
+          <w:spacing w:val="-1"/>
+          <w:lang w:val="en-US"/>
+        </w:rPr>
+        <w:t>dapat</w:t>
+      </w:r>
+      <w:proofErr w:type="spellEnd"/>
+      <w:r>
+        <w:rPr>
+          <w:rFonts w:ascii="Arial" w:hAnsi="Arial" w:cs="Arial"/>
+          <w:spacing w:val="-1"/>
+          <w:lang w:val="en-US"/>
+        </w:rPr>
+        <w:t xml:space="preserve"> </w:t>
+      </w:r>
+      <w:proofErr w:type="spellStart"/>
+      <w:r>
+        <w:rPr>
+          <w:rFonts w:ascii="Arial" w:hAnsi="Arial" w:cs="Arial"/>
+          <w:spacing w:val="-1"/>
+          <w:lang w:val="en-US"/>
+        </w:rPr>
+        <w:t>meningkatkan</w:t>
+      </w:r>
+      <w:proofErr w:type="spellEnd"/>
+      <w:r>
+        <w:rPr>
+          <w:rFonts w:ascii="Arial" w:hAnsi="Arial" w:cs="Arial"/>
+          <w:spacing w:val="-1"/>
+          <w:lang w:val="en-US"/>
+        </w:rPr>
+        <w:t xml:space="preserve"> </w:t>
+      </w:r>
+      <w:proofErr w:type="spellStart"/>
+      <w:r>
+        <w:rPr>
+          <w:rFonts w:ascii="Arial" w:hAnsi="Arial" w:cs="Arial"/>
+          <w:spacing w:val="-1"/>
+          <w:lang w:val="en-US"/>
+        </w:rPr>
+        <w:t>keamanan</w:t>
+      </w:r>
+      <w:proofErr w:type="spellEnd"/>
+      <w:r>
+        <w:rPr>
+          <w:rFonts w:ascii="Arial" w:hAnsi="Arial" w:cs="Arial"/>
+          <w:spacing w:val="-1"/>
+          <w:lang w:val="en-US"/>
+        </w:rPr>
+        <w:t xml:space="preserve"> pada </w:t>
+      </w:r>
+      <w:proofErr w:type="spellStart"/>
+      <w:r>
+        <w:rPr>
+          <w:rFonts w:ascii="Arial" w:hAnsi="Arial" w:cs="Arial"/>
+          <w:spacing w:val="-1"/>
+          <w:lang w:val="en-US"/>
+        </w:rPr>
+        <w:t>sepeda</w:t>
+      </w:r>
+      <w:proofErr w:type="spellEnd"/>
+      <w:r>
+        <w:rPr>
+          <w:rFonts w:ascii="Arial" w:hAnsi="Arial" w:cs="Arial"/>
+          <w:spacing w:val="-1"/>
+          <w:lang w:val="en-US"/>
+        </w:rPr>
+        <w:t xml:space="preserve"> motor </w:t>
+      </w:r>
+      <w:proofErr w:type="spellStart"/>
+      <w:r>
+        <w:rPr>
+          <w:rFonts w:ascii="Arial" w:hAnsi="Arial" w:cs="Arial"/>
+          <w:spacing w:val="-1"/>
+          <w:lang w:val="en-US"/>
+        </w:rPr>
+        <w:t>dimana</w:t>
+      </w:r>
+      <w:proofErr w:type="spellEnd"/>
+      <w:r>
+        <w:rPr>
+          <w:rFonts w:ascii="Arial" w:hAnsi="Arial" w:cs="Arial"/>
+          <w:spacing w:val="-1"/>
+          <w:lang w:val="en-US"/>
+        </w:rPr>
+        <w:t xml:space="preserve"> </w:t>
+      </w:r>
+      <w:proofErr w:type="spellStart"/>
+      <w:r>
+        <w:rPr>
+          <w:rFonts w:ascii="Arial" w:hAnsi="Arial" w:cs="Arial"/>
+          <w:spacing w:val="-1"/>
+          <w:lang w:val="en-US"/>
+        </w:rPr>
+        <w:t>apabila</w:t>
+      </w:r>
+      <w:proofErr w:type="spellEnd"/>
+      <w:r>
+        <w:rPr>
+          <w:rFonts w:ascii="Arial" w:hAnsi="Arial" w:cs="Arial"/>
+          <w:spacing w:val="-1"/>
+          <w:lang w:val="en-US"/>
+        </w:rPr>
+        <w:t xml:space="preserve"> motor </w:t>
+      </w:r>
+      <w:proofErr w:type="spellStart"/>
+      <w:r>
+        <w:rPr>
+          <w:rFonts w:ascii="Arial" w:hAnsi="Arial" w:cs="Arial"/>
+          <w:spacing w:val="-1"/>
+          <w:lang w:val="en-US"/>
+        </w:rPr>
+        <w:t>berada</w:t>
+      </w:r>
+      <w:proofErr w:type="spellEnd"/>
+      <w:r>
+        <w:rPr>
+          <w:rFonts w:ascii="Arial" w:hAnsi="Arial" w:cs="Arial"/>
+          <w:spacing w:val="-1"/>
+          <w:lang w:val="en-US"/>
+        </w:rPr>
+        <w:t xml:space="preserve"> di </w:t>
+      </w:r>
+      <w:proofErr w:type="spellStart"/>
+      <w:r>
+        <w:rPr>
+          <w:rFonts w:ascii="Arial" w:hAnsi="Arial" w:cs="Arial"/>
+          <w:spacing w:val="-1"/>
+          <w:lang w:val="en-US"/>
+        </w:rPr>
+        <w:t>luar</w:t>
+      </w:r>
+      <w:proofErr w:type="spellEnd"/>
+      <w:r>
+        <w:rPr>
+          <w:rFonts w:ascii="Arial" w:hAnsi="Arial" w:cs="Arial"/>
+          <w:spacing w:val="-1"/>
+          <w:lang w:val="en-US"/>
+        </w:rPr>
+        <w:t xml:space="preserve"> radius yang </w:t>
+      </w:r>
+      <w:proofErr w:type="spellStart"/>
+      <w:r>
+        <w:rPr>
+          <w:rFonts w:ascii="Arial" w:hAnsi="Arial" w:cs="Arial"/>
+          <w:spacing w:val="-1"/>
+          <w:lang w:val="en-US"/>
+        </w:rPr>
+        <w:t>telah</w:t>
+      </w:r>
+      <w:proofErr w:type="spellEnd"/>
+      <w:r>
+        <w:rPr>
+          <w:rFonts w:ascii="Arial" w:hAnsi="Arial" w:cs="Arial"/>
+          <w:spacing w:val="-1"/>
+          <w:lang w:val="en-US"/>
+        </w:rPr>
+        <w:t xml:space="preserve"> </w:t>
+      </w:r>
+      <w:proofErr w:type="spellStart"/>
+      <w:r>
+        <w:rPr>
+          <w:rFonts w:ascii="Arial" w:hAnsi="Arial" w:cs="Arial"/>
+          <w:spacing w:val="-1"/>
+          <w:lang w:val="en-US"/>
+        </w:rPr>
+        <w:t>ditentukan</w:t>
+      </w:r>
+      <w:proofErr w:type="spellEnd"/>
+      <w:r>
+        <w:rPr>
+          <w:rFonts w:ascii="Arial" w:hAnsi="Arial" w:cs="Arial"/>
+          <w:spacing w:val="-1"/>
+          <w:lang w:val="en-US"/>
+        </w:rPr>
+        <w:t xml:space="preserve"> </w:t>
+      </w:r>
+      <w:proofErr w:type="spellStart"/>
+      <w:r>
+        <w:rPr>
+          <w:rFonts w:ascii="Arial" w:hAnsi="Arial" w:cs="Arial"/>
+          <w:spacing w:val="-1"/>
+          <w:lang w:val="en-US"/>
+        </w:rPr>
+        <w:t>maka</w:t>
+      </w:r>
+      <w:proofErr w:type="spellEnd"/>
+      <w:r>
+        <w:rPr>
+          <w:rFonts w:ascii="Arial" w:hAnsi="Arial" w:cs="Arial"/>
+          <w:spacing w:val="-1"/>
+          <w:lang w:val="en-US"/>
+        </w:rPr>
+        <w:t xml:space="preserve"> </w:t>
+      </w:r>
+      <w:proofErr w:type="spellStart"/>
+      <w:r>
+        <w:rPr>
+          <w:rFonts w:ascii="Arial" w:hAnsi="Arial" w:cs="Arial"/>
+          <w:spacing w:val="-1"/>
+          <w:lang w:val="en-US"/>
+        </w:rPr>
+        <w:t>akan</w:t>
+      </w:r>
+      <w:proofErr w:type="spellEnd"/>
+      <w:r>
+        <w:rPr>
+          <w:rFonts w:ascii="Arial" w:hAnsi="Arial" w:cs="Arial"/>
+          <w:spacing w:val="-1"/>
+          <w:lang w:val="en-US"/>
+        </w:rPr>
+        <w:t xml:space="preserve"> </w:t>
+      </w:r>
+      <w:proofErr w:type="spellStart"/>
+      <w:r>
+        <w:rPr>
+          <w:rFonts w:ascii="Arial" w:hAnsi="Arial" w:cs="Arial"/>
+          <w:spacing w:val="-1"/>
+          <w:lang w:val="en-US"/>
+        </w:rPr>
+        <w:t>mematikan</w:t>
+      </w:r>
+      <w:proofErr w:type="spellEnd"/>
+      <w:r>
+        <w:rPr>
+          <w:rFonts w:ascii="Arial" w:hAnsi="Arial" w:cs="Arial"/>
+          <w:spacing w:val="-1"/>
+          <w:lang w:val="en-US"/>
+        </w:rPr>
+        <w:t xml:space="preserve"> </w:t>
+      </w:r>
+      <w:proofErr w:type="spellStart"/>
+      <w:r>
+        <w:rPr>
+          <w:rFonts w:ascii="Arial" w:hAnsi="Arial" w:cs="Arial"/>
+          <w:spacing w:val="-1"/>
+          <w:lang w:val="en-US"/>
+        </w:rPr>
+        <w:t>mesin</w:t>
+      </w:r>
+      <w:proofErr w:type="spellEnd"/>
+      <w:r>
+        <w:rPr>
+          <w:rFonts w:ascii="Arial" w:hAnsi="Arial" w:cs="Arial"/>
+          <w:spacing w:val="-1"/>
+          <w:lang w:val="en-US"/>
+        </w:rPr>
+        <w:t xml:space="preserve"> </w:t>
+      </w:r>
+      <w:proofErr w:type="spellStart"/>
+      <w:r>
+        <w:rPr>
+          <w:rFonts w:ascii="Arial" w:hAnsi="Arial" w:cs="Arial"/>
+          <w:spacing w:val="-1"/>
+          <w:lang w:val="en-US"/>
+        </w:rPr>
+        <w:t>secara</w:t>
+      </w:r>
+      <w:proofErr w:type="spellEnd"/>
+      <w:r>
+        <w:rPr>
+          <w:rFonts w:ascii="Arial" w:hAnsi="Arial" w:cs="Arial"/>
+          <w:spacing w:val="-1"/>
+          <w:lang w:val="en-US"/>
+        </w:rPr>
+        <w:t xml:space="preserve"> </w:t>
+      </w:r>
+      <w:proofErr w:type="spellStart"/>
+      <w:r>
+        <w:rPr>
+          <w:rFonts w:ascii="Arial" w:hAnsi="Arial" w:cs="Arial"/>
+          <w:spacing w:val="-1"/>
+          <w:lang w:val="en-US"/>
+        </w:rPr>
+        <w:t>otomatis</w:t>
+      </w:r>
+      <w:proofErr w:type="spellEnd"/>
+      <w:r>
+        <w:rPr>
+          <w:rFonts w:ascii="Arial" w:hAnsi="Arial" w:cs="Arial"/>
+          <w:spacing w:val="-1"/>
+          <w:lang w:val="en-US"/>
+        </w:rPr>
+        <w:t>.</w:t>
+      </w:r>
     </w:p>
     <w:p>
       <w:pPr>
@@ -22365,7 +23155,15 @@
           <w:noProof/>
           <w:lang w:val="en-US"/>
         </w:rPr>
-        <w:t xml:space="preserve">Ahuja, P., &amp; Bhavsar, K. (2018). Microcontroller Based Smart Helmet Using GSM &amp; GPRS. </w:t>
+        <w:t xml:space="preserve">Ahuja, P., &amp; Bhavsar, K. (2018). Microcontroller Based Smart Helmet </w:t>
+      </w:r>
+      <w:r>
+        <w:rPr>
+          <w:rFonts w:ascii="Arial" w:hAnsi="Arial" w:cs="Arial"/>
+          <w:noProof/>
+          <w:lang w:val="en-US"/>
+        </w:rPr>
+        <w:t xml:space="preserve">Using GSM &amp; GPRS. </w:t>
       </w:r>
       <w:r>
         <w:rPr>
@@ -22475,7 +23273,18 @@
           <w:noProof/>
           <w:lang w:val="en-US"/>
         </w:rPr>
-        <w:t>Proceedings of 2019 International Conference on Computational Intelligence and Knowledge Economy, ICCIKE 2019</w:t>
+        <w:t xml:space="preserve">Proceedings of 2019 International Conference on </w:t>
+      </w:r>
+      <w:r>
+        <w:rPr>
+          <w:rFonts w:ascii="Arial" w:hAnsi="Arial" w:cs="Arial"/>
+          <w:i/>
+          <w:iCs/>
+          <w:noProof/>
+          <w:lang w:val="en-US"/>
+        </w:rPr>
+        <w:lastRenderedPageBreak/>
+        <w:t>Computational Intelligence and Knowledge Economy, ICCIKE 2019</w:t>
       </w:r>
       <w:r>
         <w:rPr>
@@ -22547,7 +23356,6 @@
           <w:noProof/>
           <w:lang w:val="en-US"/>
         </w:rPr>
-        <w:lastRenderedPageBreak/>
         <w:t xml:space="preserve">BPS. (2018). Statistik Kriminal 2018. In Subdirektorat Statistik Politik dan Keamanan (Ed.), </w:t>
       </w:r>
       <w:r>
@@ -22748,7 +23556,15 @@
           <w:noProof/>
           <w:lang w:val="en-US"/>
         </w:rPr>
-        <w:t>, 1–5. https://doi.org/10.1109/ICSIMA.2018.8688783</w:t>
+        <w:t xml:space="preserve">, </w:t>
+      </w:r>
+      <w:r>
+        <w:rPr>
+          <w:rFonts w:ascii="Arial" w:hAnsi="Arial" w:cs="Arial"/>
+          <w:noProof/>
+          <w:lang w:val="en-US"/>
+        </w:rPr>
+        <w:t>1–5. https://doi.org/10.1109/ICSIMA.2018.8688783</w:t>
       </w:r>
     </w:p>
     <w:p>
@@ -22840,17 +23656,7 @@
           <w:noProof/>
           <w:lang w:val="en-US"/>
         </w:rPr>
-        <w:t xml:space="preserve">2018 IEEE Asia Pacific Conference on </w:t>
-      </w:r>
-      <w:r>
-        <w:rPr>
-          <w:rFonts w:ascii="Arial" w:hAnsi="Arial" w:cs="Arial"/>
-          <w:i/>
-          <w:iCs/>
-          <w:noProof/>
-          <w:lang w:val="en-US"/>
-        </w:rPr>
-        <w:t>Circuits and Systems (APCCAS)</w:t>
+        <w:t>2018 IEEE Asia Pacific Conference on Circuits and Systems (APCCAS)</w:t>
       </w:r>
       <w:r>
         <w:rPr>
@@ -23091,6 +23897,7 @@
           <w:noProof/>
           <w:lang w:val="en-US"/>
         </w:rPr>
+        <w:lastRenderedPageBreak/>
         <w:t>International Conference on Current Trends in Computer, Electrical, Electronics and Communication, CTCEEC 2017</w:t>
       </w:r>
       <w:r>
@@ -23132,18 +23939,7 @@
           <w:noProof/>
           <w:lang w:val="en-US"/>
         </w:rPr>
-        <w:t xml:space="preserve">Proceedings - 2018 IEEE 4th International Symposium on Smart Electronic </w:t>
-      </w:r>
-      <w:r>
-        <w:rPr>
-          <w:rFonts w:ascii="Arial" w:hAnsi="Arial" w:cs="Arial"/>
-          <w:i/>
-          <w:iCs/>
-          <w:noProof/>
-          <w:lang w:val="en-US"/>
-        </w:rPr>
-        <w:lastRenderedPageBreak/>
-        <w:t>Systems, iSES 2018</w:t>
+        <w:t>Proceedings - 2018 IEEE 4th International Symposium on Smart Electronic Systems, iSES 2018</w:t>
       </w:r>
       <w:r>
         <w:rPr>
@@ -23374,7 +24170,15 @@
           <w:noProof/>
           <w:lang w:val="en-US"/>
         </w:rPr>
-        <w:t xml:space="preserve">Rosyid, A., Budi, A. S., &amp; Susilo, P. H. (2020). Kontrol Sistem Starter Sepeda Motor Berbasis Mikrokontroler Dengan Smartphone Android Menggunakan Voice Recognition. </w:t>
+        <w:t xml:space="preserve">Rosyid, A., Budi, A. S., &amp; Susilo, P. H. (2020). Kontrol Sistem Starter Sepeda </w:t>
+      </w:r>
+      <w:r>
+        <w:rPr>
+          <w:rFonts w:ascii="Arial" w:hAnsi="Arial" w:cs="Arial"/>
+          <w:noProof/>
+          <w:lang w:val="en-US"/>
+        </w:rPr>
+        <w:t xml:space="preserve">Motor Berbasis Mikrokontroler Dengan Smartphone Android Menggunakan Voice Recognition. </w:t>
       </w:r>
       <w:r>
         <w:rPr>
@@ -23443,17 +24247,7 @@
           <w:noProof/>
           <w:lang w:val="en-US"/>
         </w:rPr>
-        <w:t xml:space="preserve">ELKOMIKA: Jurnal </w:t>
-      </w:r>
-      <w:r>
-        <w:rPr>
-          <w:rFonts w:ascii="Arial" w:hAnsi="Arial" w:cs="Arial"/>
-          <w:i/>
-          <w:iCs/>
-          <w:noProof/>
-          <w:lang w:val="en-US"/>
-        </w:rPr>
-        <w:t>Teknik Energi Elektrik, Teknik Telekomunikasi, &amp; Teknik Elektronika</w:t>
+        <w:t>ELKOMIKA: Jurnal Teknik Energi Elektrik, Teknik Telekomunikasi, &amp; Teknik Elektronika</w:t>
       </w:r>
       <w:r>
         <w:rPr>

</xml_diff>

<commit_message>
revisi hasil dan pembahasan 14 juni 2021
</commit_message>
<xml_diff>
--- a/Files/Jurnal_out/33425-79483-1-RV.docx
+++ b/Files/Jurnal_out/33425-79483-1-RV.docx
@@ -470,7 +470,6 @@
           <w:szCs w:val="20"/>
         </w:rPr>
       </w:pPr>
-      <w:commentRangeStart w:id="0"/>
       <w:r>
         <w:rPr>
           <w:rFonts w:ascii="Arial" w:hAnsi="Arial" w:cs="Arial"/>
@@ -546,13 +545,6 @@
           <w:szCs w:val="20"/>
         </w:rPr>
         <w:t>ak</w:t>
-      </w:r>
-      <w:commentRangeEnd w:id="0"/>
-      <w:r>
-        <w:rPr>
-          <w:rStyle w:val="CommentReference"/>
-        </w:rPr>
-        <w:commentReference w:id="0"/>
       </w:r>
     </w:p>
     <w:p>
@@ -570,8 +562,8 @@
           <w:lang w:val="en-US"/>
         </w:rPr>
       </w:pPr>
-      <w:bookmarkStart w:id="3" w:name="_Hlk54831502"/>
-      <w:bookmarkStart w:id="4" w:name="_Hlk54831776"/>
+      <w:bookmarkStart w:id="0" w:name="_Hlk54831502"/>
+      <w:bookmarkStart w:id="1" w:name="_Hlk54831776"/>
       <w:proofErr w:type="spellStart"/>
       <w:r>
         <w:rPr>
@@ -1554,8 +1546,8 @@
         </w:rPr>
         <w:t>r</w:t>
       </w:r>
-      <w:bookmarkEnd w:id="3"/>
-      <w:bookmarkEnd w:id="4"/>
+      <w:bookmarkEnd w:id="0"/>
+      <w:bookmarkEnd w:id="1"/>
       <w:r>
         <w:rPr>
           <w:rFonts w:ascii="Arial" w:hAnsi="Arial" w:cs="Arial"/>
@@ -6322,8 +6314,8 @@
           <w:color w:val="000000"/>
         </w:rPr>
         <w:sectPr>
-          <w:headerReference w:type="default" r:id="rId11"/>
-          <w:footerReference w:type="default" r:id="rId12"/>
+          <w:headerReference w:type="default" r:id="rId8"/>
+          <w:footerReference w:type="default" r:id="rId9"/>
           <w:pgSz w:w="11909" w:h="16834" w:code="9"/>
           <w:pgMar w:top="1728" w:right="1152" w:bottom="1440" w:left="1440" w:header="720" w:footer="720" w:gutter="0"/>
           <w:cols w:space="1002"/>
@@ -7388,25 +7380,7 @@
           <w:color w:val="000000"/>
           <w:spacing w:val="-1"/>
         </w:rPr>
-        <w:t xml:space="preserve"> XTensa LX6 merupakan salah satu prosesor dengan dua inti (</w:t>
-      </w:r>
-      <w:proofErr w:type="spellStart"/>
-      <w:r>
-        <w:rPr>
-          <w:rFonts w:ascii="Arial" w:hAnsi="Arial" w:cs="Arial"/>
-          <w:color w:val="000000"/>
-          <w:spacing w:val="-1"/>
-        </w:rPr>
-        <w:t>Dual</w:t>
-      </w:r>
-      <w:proofErr w:type="spellEnd"/>
-      <w:r>
-        <w:rPr>
-          <w:rFonts w:ascii="Arial" w:hAnsi="Arial" w:cs="Arial"/>
-          <w:color w:val="000000"/>
-          <w:spacing w:val="-1"/>
-        </w:rPr>
-        <w:t xml:space="preserve"> Core) berbasis 32-bit pada perangkat yang memiliki </w:t>
+        <w:t xml:space="preserve"> XTensa LX6 merupakan salah satu prosesor dengan dua inti (Dual Core) berbasis 32-bit pada perangkat yang memiliki </w:t>
       </w:r>
       <w:proofErr w:type="spellStart"/>
       <w:r>
@@ -8624,7 +8598,7 @@
                     <pic:cNvPicPr/>
                   </pic:nvPicPr>
                   <pic:blipFill>
-                    <a:blip r:embed="rId13"/>
+                    <a:blip r:embed="rId10"/>
                     <a:stretch>
                       <a:fillRect/>
                     </a:stretch>
@@ -9186,7 +9160,7 @@
                     </pic:cNvPicPr>
                   </pic:nvPicPr>
                   <pic:blipFill>
-                    <a:blip r:embed="rId14" cstate="print">
+                    <a:blip r:embed="rId11" cstate="print">
                       <a:extLst>
                         <a:ext uri="{28A0092B-C50C-407E-A947-70E740481C1C}">
                           <a14:useLocalDpi xmlns:a14="http://schemas.microsoft.com/office/drawing/2010/main" val="0"/>
@@ -9784,7 +9758,7 @@
                     <pic:cNvPicPr/>
                   </pic:nvPicPr>
                   <pic:blipFill>
-                    <a:blip r:embed="rId15">
+                    <a:blip r:embed="rId12">
                       <a:extLst>
                         <a:ext uri="{28A0092B-C50C-407E-A947-70E740481C1C}">
                           <a14:useLocalDpi xmlns:a14="http://schemas.microsoft.com/office/drawing/2010/main" val="0"/>
@@ -10129,23 +10103,7 @@
           <w:rFonts w:ascii="Arial" w:hAnsi="Arial" w:cs="Arial"/>
           <w:color w:val="000000"/>
         </w:rPr>
-        <w:t xml:space="preserve"> Mikrokontroler yang akan digunakan adalah ESP32 </w:t>
-      </w:r>
-      <w:proofErr w:type="spellStart"/>
-      <w:r>
-        <w:rPr>
-          <w:rFonts w:ascii="Arial" w:hAnsi="Arial" w:cs="Arial"/>
-          <w:color w:val="000000"/>
-        </w:rPr>
-        <w:t>dual</w:t>
-      </w:r>
-      <w:proofErr w:type="spellEnd"/>
-      <w:r>
-        <w:rPr>
-          <w:rFonts w:ascii="Arial" w:hAnsi="Arial" w:cs="Arial"/>
-          <w:color w:val="000000"/>
-        </w:rPr>
-        <w:t xml:space="preserve">-core dengan arsitektur 32-bit yang diproduksi oleh produsen yang sama dengan ESP8266 yaitu </w:t>
+        <w:t xml:space="preserve"> Mikrokontroler yang akan digunakan adalah ESP32 dual-core dengan arsitektur 32-bit yang diproduksi oleh produsen yang sama dengan ESP8266 yaitu </w:t>
       </w:r>
       <w:proofErr w:type="spellStart"/>
       <w:r>
@@ -10341,9 +10299,9 @@
                   <o:lock v:ext="edit" aspectratio="t"/>
                 </v:shapetype>
                 <v:shape id="_x0000_i1030" type="#_x0000_t75" alt="" style="width:299.1pt;height:459.15pt;mso-width-percent:0;mso-height-percent:0;mso-width-percent:0;mso-height-percent:0" o:ole="">
-                  <v:imagedata r:id="rId16" o:title=""/>
+                  <v:imagedata r:id="rId13" o:title=""/>
                 </v:shape>
-                <o:OLEObject Type="Embed" ProgID="Visio.Drawing.15" ShapeID="_x0000_i1030" DrawAspect="Content" ObjectID="_1685184882" r:id="rId17"/>
+                <o:OLEObject Type="Embed" ProgID="Visio.Drawing.15" ShapeID="_x0000_i1030" DrawAspect="Content" ObjectID="_1685186218" r:id="rId14"/>
               </w:object>
             </w:r>
           </w:p>
@@ -10778,25 +10736,7 @@
           <w:color w:val="000000"/>
           <w:position w:val="-1"/>
         </w:rPr>
-        <w:t xml:space="preserve"> yang ada pada sisi pengguna dibuat berbasis perangkat mobile dan website sehingga dapat meningkatkan kompabilitas pengguna dalam mengoperasikan perangkat ini, aplikasi tersebut akan terhubung ke internet untuk mengambil data dari perangkat yang tersimpan pada database secara </w:t>
-      </w:r>
-      <w:proofErr w:type="spellStart"/>
-      <w:r>
-        <w:rPr>
-          <w:rFonts w:ascii="Arial" w:hAnsi="Arial" w:cs="Arial"/>
-          <w:color w:val="000000"/>
-          <w:position w:val="-1"/>
-        </w:rPr>
-        <w:t>online</w:t>
-      </w:r>
-      <w:proofErr w:type="spellEnd"/>
-      <w:r>
-        <w:rPr>
-          <w:rFonts w:ascii="Arial" w:hAnsi="Arial" w:cs="Arial"/>
-          <w:color w:val="000000"/>
-          <w:position w:val="-1"/>
-        </w:rPr>
-        <w:t xml:space="preserve">. Aplikasi </w:t>
+        <w:t xml:space="preserve"> yang ada pada sisi pengguna dibuat berbasis perangkat mobile dan website sehingga dapat meningkatkan kompabilitas pengguna dalam mengoperasikan perangkat ini, aplikasi tersebut akan terhubung ke internet untuk mengambil data dari perangkat yang tersimpan pada database secara online. Aplikasi </w:t>
       </w:r>
       <w:r>
         <w:rPr>
@@ -11152,9 +11092,9 @@
               </w:rPr>
               <w:object w:dxaOrig="6526" w:dyaOrig="7621" w14:anchorId="13269122">
                 <v:shape id="_x0000_i1029" type="#_x0000_t75" alt="" style="width:229.3pt;height:269.15pt;mso-width-percent:0;mso-height-percent:0;mso-width-percent:0;mso-height-percent:0" o:ole="">
-                  <v:imagedata r:id="rId18" o:title=""/>
+                  <v:imagedata r:id="rId15" o:title=""/>
                 </v:shape>
-                <o:OLEObject Type="Embed" ProgID="Visio.Drawing.15" ShapeID="_x0000_i1029" DrawAspect="Content" ObjectID="_1685184883" r:id="rId19"/>
+                <o:OLEObject Type="Embed" ProgID="Visio.Drawing.15" ShapeID="_x0000_i1029" DrawAspect="Content" ObjectID="_1685186219" r:id="rId16"/>
               </w:object>
             </w:r>
           </w:p>
@@ -11268,9 +11208,9 @@
               </w:rPr>
               <w:object w:dxaOrig="7695" w:dyaOrig="4741" w14:anchorId="206D56FA">
                 <v:shape id="_x0000_i1028" type="#_x0000_t75" alt="" style="width:212.1pt;height:116.85pt;mso-width-percent:0;mso-height-percent:0;mso-width-percent:0;mso-height-percent:0" o:ole="">
-                  <v:imagedata r:id="rId20" o:title=""/>
+                  <v:imagedata r:id="rId17" o:title=""/>
                 </v:shape>
-                <o:OLEObject Type="Embed" ProgID="Visio.Drawing.15" ShapeID="_x0000_i1028" DrawAspect="Content" ObjectID="_1685184884" r:id="rId21"/>
+                <o:OLEObject Type="Embed" ProgID="Visio.Drawing.15" ShapeID="_x0000_i1028" DrawAspect="Content" ObjectID="_1685186220" r:id="rId18"/>
               </w:object>
             </w:r>
           </w:p>
@@ -11293,9 +11233,9 @@
               </w:rPr>
               <w:object w:dxaOrig="7786" w:dyaOrig="6720" w14:anchorId="419F5445">
                 <v:shape id="_x0000_i1027" type="#_x0000_t75" alt="" style="width:186.1pt;height:127.95pt;mso-width-percent:0;mso-height-percent:0;mso-width-percent:0;mso-height-percent:0" o:ole="">
-                  <v:imagedata r:id="rId22" o:title=""/>
+                  <v:imagedata r:id="rId19" o:title=""/>
                 </v:shape>
-                <o:OLEObject Type="Embed" ProgID="Visio.Drawing.15" ShapeID="_x0000_i1027" DrawAspect="Content" ObjectID="_1685184885" r:id="rId23"/>
+                <o:OLEObject Type="Embed" ProgID="Visio.Drawing.15" ShapeID="_x0000_i1027" DrawAspect="Content" ObjectID="_1685186221" r:id="rId20"/>
               </w:object>
             </w:r>
           </w:p>
@@ -11631,51 +11571,15 @@
           <w:color w:val="000000"/>
           <w:position w:val="-1"/>
         </w:rPr>
-        <w:t xml:space="preserve">Pengendalian relay dilakukan secara </w:t>
-      </w:r>
-      <w:proofErr w:type="spellStart"/>
-      <w:r>
-        <w:rPr>
-          <w:rFonts w:ascii="Arial" w:hAnsi="Arial" w:cs="Arial"/>
-          <w:color w:val="000000"/>
-          <w:position w:val="-1"/>
-        </w:rPr>
-        <w:t>online</w:t>
-      </w:r>
-      <w:proofErr w:type="spellEnd"/>
-      <w:r>
-        <w:rPr>
-          <w:rFonts w:ascii="Arial" w:hAnsi="Arial" w:cs="Arial"/>
-          <w:color w:val="000000"/>
-          <w:position w:val="-1"/>
-        </w:rPr>
-        <w:t xml:space="preserve"> menggunakan aplikasi yang akan mengirimkan nilai integer yang akan </w:t>
-      </w:r>
-      <w:r>
-        <w:rPr>
-          <w:rFonts w:ascii="Arial" w:hAnsi="Arial" w:cs="Arial"/>
-          <w:color w:val="000000"/>
-          <w:position w:val="-1"/>
-        </w:rPr>
-        <w:t xml:space="preserve">dikonversikan menjadi array lalu dikirim ke </w:t>
-      </w:r>
-      <w:proofErr w:type="spellStart"/>
-      <w:r>
-        <w:rPr>
-          <w:rFonts w:ascii="Arial" w:hAnsi="Arial" w:cs="Arial"/>
-          <w:color w:val="000000"/>
-          <w:position w:val="-1"/>
-        </w:rPr>
-        <w:t>online</w:t>
-      </w:r>
-      <w:proofErr w:type="spellEnd"/>
-      <w:r>
-        <w:rPr>
-          <w:rFonts w:ascii="Arial" w:hAnsi="Arial" w:cs="Arial"/>
-          <w:color w:val="000000"/>
-          <w:position w:val="-1"/>
-        </w:rPr>
-        <w:t xml:space="preserve"> database sehingga array tersebut dapat diproses menjadi trigger oleh perangkat hardware untuk menentukan logika yang akan digunakan relay pada sepeda moto</w:t>
+        <w:t xml:space="preserve">Pengendalian relay dilakukan secara online menggunakan aplikasi yang akan mengirimkan nilai integer yang akan </w:t>
+      </w:r>
+      <w:r>
+        <w:rPr>
+          <w:rFonts w:ascii="Arial" w:hAnsi="Arial" w:cs="Arial"/>
+          <w:color w:val="000000"/>
+          <w:position w:val="-1"/>
+        </w:rPr>
+        <w:t>dikonversikan menjadi array lalu dikirim ke online database sehingga array tersebut dapat diproses menjadi trigger oleh perangkat hardware untuk menentukan logika yang akan digunakan relay pada sepeda moto</w:t>
       </w:r>
       <w:r>
         <w:rPr>
@@ -11754,9 +11658,9 @@
               </w:rPr>
               <w:object w:dxaOrig="5761" w:dyaOrig="8821" w14:anchorId="7704ADE3">
                 <v:shape id="_x0000_i1026" type="#_x0000_t75" alt="" style="width:152.3pt;height:232.05pt;mso-width-percent:0;mso-height-percent:0;mso-width-percent:0;mso-height-percent:0" o:ole="">
-                  <v:imagedata r:id="rId24" o:title=""/>
+                  <v:imagedata r:id="rId21" o:title=""/>
                 </v:shape>
-                <o:OLEObject Type="Embed" ProgID="Visio.Drawing.15" ShapeID="_x0000_i1026" DrawAspect="Content" ObjectID="_1685184886" r:id="rId25"/>
+                <o:OLEObject Type="Embed" ProgID="Visio.Drawing.15" ShapeID="_x0000_i1026" DrawAspect="Content" ObjectID="_1685186222" r:id="rId22"/>
               </w:object>
             </w:r>
           </w:p>
@@ -11782,9 +11686,9 @@
               </w:rPr>
               <w:object w:dxaOrig="5670" w:dyaOrig="12136" w14:anchorId="1653260E">
                 <v:shape id="_x0000_i1025" type="#_x0000_t75" alt="" style="width:135.15pt;height:230.95pt;mso-width-percent:0;mso-height-percent:0;mso-width-percent:0;mso-height-percent:0" o:ole="">
-                  <v:imagedata r:id="rId26" o:title=""/>
+                  <v:imagedata r:id="rId23" o:title=""/>
                 </v:shape>
-                <o:OLEObject Type="Embed" ProgID="Visio.Drawing.15" ShapeID="_x0000_i1025" DrawAspect="Content" ObjectID="_1685184887" r:id="rId27"/>
+                <o:OLEObject Type="Embed" ProgID="Visio.Drawing.15" ShapeID="_x0000_i1025" DrawAspect="Content" ObjectID="_1685186223" r:id="rId24"/>
               </w:object>
             </w:r>
           </w:p>
@@ -12211,10 +12115,10 @@
                           <pic:cNvPicPr/>
                         </pic:nvPicPr>
                         <pic:blipFill>
-                          <a:blip r:embed="rId28">
+                          <a:blip r:embed="rId25">
                             <a:extLst>
                               <a:ext uri="{96DAC541-7B7A-43D3-8B79-37D633B846F1}">
-                                <asvg:svgBlip xmlns:asvg="http://schemas.microsoft.com/office/drawing/2016/SVG/main" r:embed="rId29"/>
+                                <asvg:svgBlip xmlns:asvg="http://schemas.microsoft.com/office/drawing/2016/SVG/main" r:embed="rId26"/>
                               </a:ext>
                             </a:extLst>
                           </a:blip>
@@ -12540,25 +12444,7 @@
           <w:color w:val="000000"/>
           <w:position w:val="-1"/>
         </w:rPr>
-        <w:t xml:space="preserve"> menggunakan </w:t>
-      </w:r>
-      <w:proofErr w:type="spellStart"/>
-      <w:r>
-        <w:rPr>
-          <w:rFonts w:ascii="Arial" w:hAnsi="Arial" w:cs="Arial"/>
-          <w:color w:val="000000"/>
-          <w:position w:val="-1"/>
-        </w:rPr>
-        <w:t>json</w:t>
-      </w:r>
-      <w:proofErr w:type="spellEnd"/>
-      <w:r>
-        <w:rPr>
-          <w:rFonts w:ascii="Arial" w:hAnsi="Arial" w:cs="Arial"/>
-          <w:color w:val="000000"/>
-          <w:position w:val="-1"/>
-        </w:rPr>
-        <w:t xml:space="preserve"> untuk menghasilkan </w:t>
+        <w:t xml:space="preserve"> menggunakan json untuk menghasilkan </w:t>
       </w:r>
       <w:r>
         <w:rPr>
@@ -12744,7 +12630,7 @@
                           <pic:cNvPicPr/>
                         </pic:nvPicPr>
                         <pic:blipFill>
-                          <a:blip r:embed="rId30"/>
+                          <a:blip r:embed="rId27"/>
                           <a:stretch>
                             <a:fillRect/>
                           </a:stretch>
@@ -12891,39 +12777,6 @@
         </w:rPr>
         <w:t xml:space="preserve"> </w:t>
       </w:r>
-      <w:r>
-        <w:rPr>
-          <w:rFonts w:ascii="Arial" w:hAnsi="Arial" w:cs="Arial"/>
-          <w:b/>
-          <w:bCs/>
-          <w:color w:val="000000"/>
-          <w:spacing w:val="-6"/>
-          <w:lang w:val="en-US"/>
-        </w:rPr>
-        <w:t>DAN PEMBA</w:t>
-      </w:r>
-      <w:r>
-        <w:rPr>
-          <w:rFonts w:ascii="Arial" w:hAnsi="Arial" w:cs="Arial"/>
-          <w:b/>
-          <w:bCs/>
-          <w:color w:val="000000"/>
-          <w:spacing w:val="-6"/>
-          <w:lang w:val="en-US"/>
-        </w:rPr>
-        <w:t>H</w:t>
-      </w:r>
-      <w:r>
-        <w:rPr>
-          <w:rFonts w:ascii="Arial" w:hAnsi="Arial" w:cs="Arial"/>
-          <w:b/>
-          <w:bCs/>
-          <w:color w:val="000000"/>
-          <w:spacing w:val="-6"/>
-          <w:lang w:val="en-US"/>
-        </w:rPr>
-        <w:t>ASAN</w:t>
-      </w:r>
     </w:p>
     <w:p>
       <w:pPr>
@@ -12955,6 +12808,99 @@
           <w:color w:val="000000"/>
         </w:rPr>
         <w:t>tingkat akurasi koordinat yang dikirimkan perangkat keras dan koordinat lokasi sebenarnya.</w:t>
+      </w:r>
+    </w:p>
+    <w:p>
+      <w:pPr>
+        <w:spacing w:after="0" w:line="240" w:lineRule="auto"/>
+        <w:ind w:firstLine="567"/>
+        <w:jc w:val="both"/>
+        <w:rPr>
+          <w:rFonts w:ascii="Arial" w:hAnsi="Arial" w:cs="Arial"/>
+          <w:color w:val="000000"/>
+        </w:rPr>
+      </w:pPr>
+    </w:p>
+    <w:p>
+      <w:pPr>
+        <w:spacing w:after="0" w:line="240" w:lineRule="auto"/>
+        <w:ind w:firstLine="567"/>
+        <w:jc w:val="both"/>
+        <w:rPr>
+          <w:rFonts w:ascii="Arial" w:hAnsi="Arial" w:cs="Arial"/>
+          <w:color w:val="000000"/>
+        </w:rPr>
+      </w:pPr>
+    </w:p>
+    <w:p>
+      <w:pPr>
+        <w:spacing w:after="0" w:line="240" w:lineRule="auto"/>
+        <w:contextualSpacing/>
+        <w:jc w:val="both"/>
+        <w:rPr>
+          <w:rFonts w:ascii="Arial" w:hAnsi="Arial" w:cs="Arial"/>
+          <w:b/>
+          <w:bCs/>
+          <w:caps/>
+          <w:color w:val="000000"/>
+          <w:spacing w:val="3"/>
+          <w:position w:val="-1"/>
+          <w:lang w:val="en-US"/>
+        </w:rPr>
+      </w:pPr>
+      <w:r>
+        <w:rPr>
+          <w:rFonts w:ascii="Arial" w:hAnsi="Arial" w:cs="Arial"/>
+          <w:b/>
+          <w:bCs/>
+          <w:caps/>
+          <w:color w:val="000000"/>
+          <w:spacing w:val="3"/>
+          <w:position w:val="-1"/>
+          <w:lang w:val="en-US"/>
+        </w:rPr>
+        <w:t>Akurasi jarak</w:t>
+      </w:r>
+    </w:p>
+    <w:p>
+      <w:pPr>
+        <w:spacing w:after="0" w:line="240" w:lineRule="auto"/>
+        <w:ind w:firstLine="547"/>
+        <w:contextualSpacing/>
+        <w:jc w:val="both"/>
+        <w:rPr>
+          <w:rFonts w:ascii="Arial" w:hAnsi="Arial" w:cs="Arial"/>
+          <w:color w:val="000000"/>
+          <w:spacing w:val="3"/>
+          <w:position w:val="-1"/>
+        </w:rPr>
+      </w:pPr>
+      <w:r>
+        <w:rPr>
+          <w:rFonts w:ascii="Arial" w:hAnsi="Arial" w:cs="Arial"/>
+          <w:color w:val="000000"/>
+          <w:spacing w:val="3"/>
+          <w:position w:val="-1"/>
+        </w:rPr>
+        <w:t xml:space="preserve">Pada </w:t>
+      </w:r>
+      <w:r>
+        <w:rPr>
+          <w:rFonts w:ascii="Arial" w:hAnsi="Arial" w:cs="Arial"/>
+          <w:color w:val="000000"/>
+          <w:spacing w:val="3"/>
+          <w:position w:val="-1"/>
+        </w:rPr>
+        <w:t>tabel</w:t>
+      </w:r>
+      <w:r>
+        <w:rPr>
+          <w:rFonts w:ascii="Arial" w:hAnsi="Arial" w:cs="Arial"/>
+          <w:color w:val="000000"/>
+          <w:spacing w:val="3"/>
+          <w:position w:val="-1"/>
+        </w:rPr>
+        <w:t xml:space="preserve"> 1 berikut ini merupakan hasil dari pengujian 10 data koordinat lokasi yang dikirimkan hardware ke database koordinat online dalam satuan meter dengan menggunakan persamaan berikut ini</w:t>
       </w:r>
     </w:p>
     <w:p>
@@ -12977,55 +12923,6 @@
           <w:noEndnote/>
         </w:sectPr>
       </w:pPr>
-      <w:r>
-        <w:rPr>
-          <w:rFonts w:ascii="Arial" w:hAnsi="Arial" w:cs="Arial"/>
-          <w:color w:val="000000"/>
-          <w:spacing w:val="3"/>
-          <w:position w:val="-1"/>
-        </w:rPr>
-        <w:t xml:space="preserve">Pada </w:t>
-      </w:r>
-      <w:proofErr w:type="spellStart"/>
-      <w:r>
-        <w:rPr>
-          <w:rFonts w:ascii="Arial" w:hAnsi="Arial" w:cs="Arial"/>
-          <w:color w:val="000000"/>
-          <w:spacing w:val="3"/>
-          <w:position w:val="-1"/>
-        </w:rPr>
-        <w:t>table</w:t>
-      </w:r>
-      <w:proofErr w:type="spellEnd"/>
-      <w:r>
-        <w:rPr>
-          <w:rFonts w:ascii="Arial" w:hAnsi="Arial" w:cs="Arial"/>
-          <w:color w:val="000000"/>
-          <w:spacing w:val="3"/>
-          <w:position w:val="-1"/>
-        </w:rPr>
-        <w:t xml:space="preserve"> 1 berikut ini merupakan hasil dari pengujian 10 data koordinat lokasi yang dikirimkan hardware ke database koordinat </w:t>
-      </w:r>
-      <w:proofErr w:type="spellStart"/>
-      <w:r>
-        <w:rPr>
-          <w:rFonts w:ascii="Arial" w:hAnsi="Arial" w:cs="Arial"/>
-          <w:color w:val="000000"/>
-          <w:spacing w:val="3"/>
-          <w:position w:val="-1"/>
-        </w:rPr>
-        <w:t>online</w:t>
-      </w:r>
-      <w:proofErr w:type="spellEnd"/>
-      <w:r>
-        <w:rPr>
-          <w:rFonts w:ascii="Arial" w:hAnsi="Arial" w:cs="Arial"/>
-          <w:color w:val="000000"/>
-          <w:spacing w:val="3"/>
-          <w:position w:val="-1"/>
-        </w:rPr>
-        <w:t xml:space="preserve"> dalam satuan meter dengan menggunakan persamaan berikut ini</w:t>
-      </w:r>
     </w:p>
     <w:p>
       <w:pPr>
@@ -15946,73 +15843,7 @@
         <w:rPr>
           <w:rFonts w:ascii="Arial" w:hAnsi="Arial" w:cs="Arial"/>
           <w:color w:val="000000"/>
-        </w:rPr>
-      </w:pPr>
-      <w:r>
-        <w:rPr>
-          <w:rFonts w:ascii="Arial" w:hAnsi="Arial" w:cs="Arial"/>
-          <w:color w:val="000000"/>
-        </w:rPr>
-        <w:t xml:space="preserve">Pada </w:t>
-      </w:r>
-      <w:r>
-        <w:rPr>
-          <w:rFonts w:ascii="Arial" w:hAnsi="Arial" w:cs="Arial"/>
-          <w:color w:val="000000"/>
-        </w:rPr>
-        <w:t>percobaan</w:t>
-      </w:r>
-      <w:r>
-        <w:rPr>
-          <w:rFonts w:ascii="Arial" w:hAnsi="Arial" w:cs="Arial"/>
-          <w:color w:val="000000"/>
-        </w:rPr>
-        <w:t xml:space="preserve"> yang diakukan sebanyak 10 kali menghasilkan akurasi </w:t>
-      </w:r>
-      <w:r>
-        <w:rPr>
-          <w:rFonts w:ascii="Arial" w:hAnsi="Arial" w:cs="Arial"/>
-          <w:color w:val="000000"/>
-        </w:rPr>
-        <w:lastRenderedPageBreak/>
-        <w:t xml:space="preserve">antara 4.98 sampai 50.70 meter dengan rata </w:t>
-      </w:r>
-      <w:proofErr w:type="spellStart"/>
-      <w:r>
-        <w:rPr>
-          <w:rFonts w:ascii="Arial" w:hAnsi="Arial" w:cs="Arial"/>
-          <w:color w:val="000000"/>
-        </w:rPr>
-        <w:t>rata</w:t>
-      </w:r>
-      <w:proofErr w:type="spellEnd"/>
-      <w:r>
-        <w:rPr>
-          <w:rFonts w:ascii="Arial" w:hAnsi="Arial" w:cs="Arial"/>
-          <w:color w:val="000000"/>
-        </w:rPr>
-        <w:t xml:space="preserve"> 18.09 meter. </w:t>
-      </w:r>
-    </w:p>
-    <w:p>
-      <w:pPr>
-        <w:spacing w:after="0" w:line="240" w:lineRule="auto"/>
-        <w:jc w:val="both"/>
-        <w:rPr>
-          <w:rFonts w:ascii="Arial" w:hAnsi="Arial" w:cs="Arial"/>
-          <w:b/>
-          <w:bCs/>
-          <w:color w:val="000000"/>
-        </w:rPr>
-      </w:pPr>
-    </w:p>
-    <w:p>
-      <w:pPr>
-        <w:spacing w:after="0" w:line="240" w:lineRule="auto"/>
-        <w:jc w:val="center"/>
-        <w:rPr>
-          <w:rFonts w:ascii="Arial" w:hAnsi="Arial" w:cs="Arial"/>
-          <w:color w:val="000000"/>
+          <w:lang w:val="en-US"/>
         </w:rPr>
         <w:sectPr>
           <w:type w:val="continuous"/>
@@ -16022,6 +15853,58 @@
           <w:noEndnote/>
         </w:sectPr>
       </w:pPr>
+      <w:r>
+        <w:rPr>
+          <w:rFonts w:ascii="Arial" w:hAnsi="Arial" w:cs="Arial"/>
+          <w:color w:val="000000"/>
+        </w:rPr>
+        <w:lastRenderedPageBreak/>
+        <w:t xml:space="preserve">Pada </w:t>
+      </w:r>
+      <w:r>
+        <w:rPr>
+          <w:rFonts w:ascii="Arial" w:hAnsi="Arial" w:cs="Arial"/>
+          <w:color w:val="000000"/>
+        </w:rPr>
+        <w:t>percobaan</w:t>
+      </w:r>
+      <w:r>
+        <w:rPr>
+          <w:rFonts w:ascii="Arial" w:hAnsi="Arial" w:cs="Arial"/>
+          <w:color w:val="000000"/>
+        </w:rPr>
+        <w:t xml:space="preserve"> yang diakukan sebanyak 10 kali menghasilkan akurasi </w:t>
+      </w:r>
+      <w:r>
+        <w:rPr>
+          <w:rFonts w:ascii="Arial" w:hAnsi="Arial" w:cs="Arial"/>
+          <w:color w:val="000000"/>
+        </w:rPr>
+        <w:t>antara 4.98 sampai 50.70 meter dengan rata</w:t>
+      </w:r>
+      <w:r>
+        <w:rPr>
+          <w:rFonts w:ascii="Arial" w:hAnsi="Arial" w:cs="Arial"/>
+          <w:color w:val="000000"/>
+          <w:lang w:val="en-US"/>
+        </w:rPr>
+        <w:t>-</w:t>
+      </w:r>
+      <w:r>
+        <w:rPr>
+          <w:rFonts w:ascii="Arial" w:hAnsi="Arial" w:cs="Arial"/>
+          <w:color w:val="000000"/>
+        </w:rPr>
+        <w:t>rata 18.09 mete</w:t>
+      </w:r>
+      <w:r>
+        <w:rPr>
+          <w:rFonts w:ascii="Arial" w:hAnsi="Arial" w:cs="Arial"/>
+          <w:color w:val="000000"/>
+          <w:lang w:val="en-US"/>
+        </w:rPr>
+        <w:t>r.</w:t>
+      </w:r>
     </w:p>
     <w:p>
       <w:pPr>
@@ -16068,7 +15951,7 @@
       </w:tblPr>
       <w:tblGrid>
         <w:gridCol w:w="1308"/>
-        <w:gridCol w:w="1060"/>
+        <w:gridCol w:w="1185"/>
         <w:gridCol w:w="932"/>
         <w:gridCol w:w="794"/>
         <w:gridCol w:w="849"/>
@@ -16237,15 +16120,27 @@
                 <w:spacing w:val="3"/>
               </w:rPr>
             </w:pPr>
-            <w:proofErr w:type="spellStart"/>
             <w:r>
               <w:rPr>
                 <w:rFonts w:ascii="Arial" w:hAnsi="Arial" w:cs="Arial"/>
                 <w:spacing w:val="3"/>
               </w:rPr>
-              <w:t>Kordinat</w:t>
+              <w:t>K</w:t>
             </w:r>
-            <w:proofErr w:type="spellEnd"/>
+            <w:r>
+              <w:rPr>
+                <w:rFonts w:ascii="Arial" w:hAnsi="Arial" w:cs="Arial"/>
+                <w:spacing w:val="3"/>
+              </w:rPr>
+              <w:t>o</w:t>
+            </w:r>
+            <w:r>
+              <w:rPr>
+                <w:rFonts w:ascii="Arial" w:hAnsi="Arial" w:cs="Arial"/>
+                <w:spacing w:val="3"/>
+              </w:rPr>
+              <w:t>ordinat</w:t>
+            </w:r>
           </w:p>
         </w:tc>
         <w:tc>
@@ -17797,17 +17692,24 @@
               <w:rPr>
                 <w:rFonts w:ascii="Arial" w:hAnsi="Arial" w:cs="Arial"/>
                 <w:spacing w:val="3"/>
+                <w:lang w:val="en-US"/>
               </w:rPr>
             </w:pPr>
-            <w:proofErr w:type="spellStart"/>
             <w:r>
               <w:rPr>
                 <w:rFonts w:ascii="Arial" w:hAnsi="Arial" w:cs="Arial"/>
                 <w:spacing w:val="3"/>
               </w:rPr>
-              <w:t>Rata-Rata</w:t>
+              <w:t>Rata</w:t>
             </w:r>
-            <w:proofErr w:type="spellEnd"/>
+            <w:r>
+              <w:rPr>
+                <w:rFonts w:ascii="Arial" w:hAnsi="Arial" w:cs="Arial"/>
+                <w:spacing w:val="3"/>
+                <w:lang w:val="en-US"/>
+              </w:rPr>
+              <w:t>-rata</w:t>
+            </w:r>
           </w:p>
         </w:tc>
         <w:tc>
@@ -17962,15 +17864,13 @@
         </w:rPr>
         <w:t xml:space="preserve">Proses transmisi data dengan hanya menggunakan 1 core dilakukan secara bergantian menunggu proses sebelumnya selesai </w:t>
       </w:r>
-      <w:proofErr w:type="spellStart"/>
       <w:r>
         <w:rPr>
           <w:rFonts w:ascii="Arial" w:hAnsi="Arial" w:cs="Arial"/>
           <w:spacing w:val="3"/>
         </w:rPr>
-        <w:t>seningga</w:t>
-      </w:r>
-      <w:proofErr w:type="spellEnd"/>
+        <w:t>sehingga</w:t>
+      </w:r>
       <w:r>
         <w:rPr>
           <w:rFonts w:ascii="Arial" w:hAnsi="Arial" w:cs="Arial"/>
@@ -17985,37 +17885,19 @@
         </w:rPr>
         <w:t xml:space="preserve">membutuhkan waktu yang lebih lama dengan rata-rata 12.47 detik setiap kali hardware melakukan </w:t>
       </w:r>
-      <w:proofErr w:type="spellStart"/>
       <w:r>
         <w:rPr>
           <w:rFonts w:ascii="Arial" w:hAnsi="Arial" w:cs="Arial"/>
           <w:spacing w:val="3"/>
         </w:rPr>
-        <w:t>sinkronasi</w:t>
-      </w:r>
-      <w:proofErr w:type="spellEnd"/>
+        <w:t>sinkronisasi</w:t>
+      </w:r>
       <w:r>
         <w:rPr>
           <w:rFonts w:ascii="Arial" w:hAnsi="Arial" w:cs="Arial"/>
           <w:spacing w:val="3"/>
         </w:rPr>
-        <w:t xml:space="preserve"> dengan database </w:t>
-      </w:r>
-      <w:proofErr w:type="spellStart"/>
-      <w:r>
-        <w:rPr>
-          <w:rFonts w:ascii="Arial" w:hAnsi="Arial" w:cs="Arial"/>
-          <w:spacing w:val="3"/>
-        </w:rPr>
-        <w:t>online</w:t>
-      </w:r>
-      <w:proofErr w:type="spellEnd"/>
-      <w:r>
-        <w:rPr>
-          <w:rFonts w:ascii="Arial" w:hAnsi="Arial" w:cs="Arial"/>
-          <w:spacing w:val="3"/>
-        </w:rPr>
-        <w:t>.</w:t>
+        <w:t xml:space="preserve"> dengan database online.</w:t>
       </w:r>
     </w:p>
     <w:p>
@@ -18167,15 +18049,20 @@
                 <w:spacing w:val="3"/>
               </w:rPr>
             </w:pPr>
-            <w:proofErr w:type="spellStart"/>
             <w:r>
               <w:rPr>
                 <w:rFonts w:ascii="Arial" w:hAnsi="Arial" w:cs="Arial"/>
                 <w:spacing w:val="3"/>
               </w:rPr>
-              <w:t>dibutukan</w:t>
+              <w:t>D</w:t>
             </w:r>
-            <w:proofErr w:type="spellEnd"/>
+            <w:r>
+              <w:rPr>
+                <w:rFonts w:ascii="Arial" w:hAnsi="Arial" w:cs="Arial"/>
+                <w:spacing w:val="3"/>
+              </w:rPr>
+              <w:t>ibutuhkan</w:t>
+            </w:r>
           </w:p>
         </w:tc>
       </w:tr>
@@ -19749,17 +19636,24 @@
                 <w:rFonts w:ascii="Arial" w:hAnsi="Arial" w:cs="Arial"/>
                 <w:spacing w:val="3"/>
               </w:rPr>
-              <w:t xml:space="preserve">Rata </w:t>
-            </w:r>
-            <w:proofErr w:type="spellStart"/>
-            <w:r>
-              <w:rPr>
-                <w:rFonts w:ascii="Arial" w:hAnsi="Arial" w:cs="Arial"/>
-                <w:spacing w:val="3"/>
-              </w:rPr>
               <w:t>Rata</w:t>
             </w:r>
-            <w:proofErr w:type="spellEnd"/>
+            <w:r>
+              <w:rPr>
+                <w:rFonts w:ascii="Arial" w:hAnsi="Arial" w:cs="Arial"/>
+                <w:spacing w:val="3"/>
+                <w:lang w:val="en-US"/>
+              </w:rPr>
+              <w:t>-r</w:t>
+            </w:r>
+            <w:r>
+              <w:rPr>
+                <w:rFonts w:ascii="Arial" w:hAnsi="Arial" w:cs="Arial"/>
+                <w:spacing w:val="3"/>
+                <w:lang w:val="en-US"/>
+              </w:rPr>
+              <w:t>ata</w:t>
+            </w:r>
           </w:p>
         </w:tc>
         <w:tc>
@@ -19893,49 +19787,15 @@
           <w:rFonts w:ascii="Arial" w:hAnsi="Arial" w:cs="Arial"/>
           <w:spacing w:val="3"/>
         </w:rPr>
-        <w:t xml:space="preserve">Dari hasil dari 10 kali percobaan pada tabel 3, penggunaan </w:t>
-      </w:r>
-      <w:proofErr w:type="spellStart"/>
+        <w:t xml:space="preserve">Dari hasil dari 10 kali percobaan pada tabel 3, penggunaan dual core pada sistem akan mempersingkat delay transmisi yang dibutuhkan hingga 4 detik lebih cepat </w:t>
+      </w:r>
       <w:r>
         <w:rPr>
           <w:rFonts w:ascii="Arial" w:hAnsi="Arial" w:cs="Arial"/>
           <w:spacing w:val="3"/>
         </w:rPr>
-        <w:t>dual</w:t>
-      </w:r>
-      <w:proofErr w:type="spellEnd"/>
-      <w:r>
-        <w:rPr>
-          <w:rFonts w:ascii="Arial" w:hAnsi="Arial" w:cs="Arial"/>
-          <w:spacing w:val="3"/>
-        </w:rPr>
-        <w:t xml:space="preserve"> core pada sistem akan mempersingkat </w:t>
-      </w:r>
-      <w:proofErr w:type="spellStart"/>
-      <w:r>
-        <w:rPr>
-          <w:rFonts w:ascii="Arial" w:hAnsi="Arial" w:cs="Arial"/>
-          <w:spacing w:val="3"/>
-        </w:rPr>
-        <w:t>delay</w:t>
-      </w:r>
-      <w:proofErr w:type="spellEnd"/>
-      <w:r>
-        <w:rPr>
-          <w:rFonts w:ascii="Arial" w:hAnsi="Arial" w:cs="Arial"/>
-          <w:spacing w:val="3"/>
-        </w:rPr>
-        <w:t xml:space="preserve"> transmisi yang dibutuhkan hingga 4 detik lebih cepat </w:t>
-      </w:r>
-      <w:proofErr w:type="spellStart"/>
-      <w:r>
-        <w:rPr>
-          <w:rFonts w:ascii="Arial" w:hAnsi="Arial" w:cs="Arial"/>
-          <w:spacing w:val="3"/>
-        </w:rPr>
-        <w:t>dibandinkan</w:t>
-      </w:r>
-      <w:proofErr w:type="spellEnd"/>
+        <w:t>dibandingkan</w:t>
+      </w:r>
       <w:r>
         <w:rPr>
           <w:rFonts w:ascii="Arial" w:hAnsi="Arial" w:cs="Arial"/>
@@ -19976,39 +19836,22 @@
           <w:rFonts w:ascii="Arial" w:hAnsi="Arial" w:cs="Arial"/>
           <w:spacing w:val="3"/>
         </w:rPr>
-        <w:t xml:space="preserve">Hal tersebut juga dipengaruhi oleh koneksi jaringan internet. </w:t>
-      </w:r>
-      <w:proofErr w:type="spellStart"/>
+        <w:t>Hal tersebut juga dipengaruhi oleh koneksi jaringan internet. Di</w:t>
+      </w:r>
       <w:r>
         <w:rPr>
           <w:rFonts w:ascii="Arial" w:hAnsi="Arial" w:cs="Arial"/>
           <w:spacing w:val="3"/>
-        </w:rPr>
-        <w:t>Dimana</w:t>
-      </w:r>
-      <w:proofErr w:type="spellEnd"/>
+          <w:lang w:val="en-US"/>
+        </w:rPr>
+        <w:t xml:space="preserve"> </w:t>
+      </w:r>
       <w:r>
         <w:rPr>
           <w:rFonts w:ascii="Arial" w:hAnsi="Arial" w:cs="Arial"/>
           <w:spacing w:val="3"/>
         </w:rPr>
-        <w:t xml:space="preserve"> penggunaan API dengan respons </w:t>
-      </w:r>
-      <w:proofErr w:type="spellStart"/>
-      <w:r>
-        <w:rPr>
-          <w:rFonts w:ascii="Arial" w:hAnsi="Arial" w:cs="Arial"/>
-          <w:spacing w:val="3"/>
-        </w:rPr>
-        <w:t>json</w:t>
-      </w:r>
-      <w:proofErr w:type="spellEnd"/>
-      <w:r>
-        <w:rPr>
-          <w:rFonts w:ascii="Arial" w:hAnsi="Arial" w:cs="Arial"/>
-          <w:spacing w:val="3"/>
-        </w:rPr>
-        <w:t xml:space="preserve"> sebagai balasan dapat meningkatkan waktu transmisi antar proses.</w:t>
+        <w:t>mana penggunaan API dengan respons json sebagai balasan dapat meningkatkan waktu transmisi antar proses.</w:t>
       </w:r>
     </w:p>
     <w:p>
@@ -20064,7 +19907,6 @@
           <w:color w:val="000000"/>
         </w:rPr>
       </w:pPr>
-      <w:commentRangeStart w:id="5"/>
       <w:r>
         <w:rPr>
           <w:rFonts w:ascii="Arial" w:hAnsi="Arial" w:cs="Arial"/>
@@ -20153,13 +19995,6 @@
           <w:color w:val="000000"/>
         </w:rPr>
         <w:t>AN</w:t>
-      </w:r>
-      <w:commentRangeEnd w:id="5"/>
-      <w:r>
-        <w:rPr>
-          <w:rStyle w:val="CommentReference"/>
-        </w:rPr>
-        <w:commentReference w:id="5"/>
       </w:r>
     </w:p>
     <w:p>
@@ -20178,23 +20013,22 @@
           <w:rFonts w:ascii="Arial" w:hAnsi="Arial" w:cs="Arial"/>
           <w:color w:val="000000"/>
         </w:rPr>
-        <w:t xml:space="preserve">Pembahasan bagian ini meliputi realisasi rancangan hardware sistem </w:t>
-      </w:r>
-      <w:proofErr w:type="spellStart"/>
-      <w:r>
-        <w:rPr>
-          <w:rFonts w:ascii="Arial" w:hAnsi="Arial" w:cs="Arial"/>
-          <w:color w:val="000000"/>
-        </w:rPr>
-        <w:t>monitoring</w:t>
-      </w:r>
-      <w:proofErr w:type="spellEnd"/>
-      <w:r>
-        <w:rPr>
-          <w:rFonts w:ascii="Arial" w:hAnsi="Arial" w:cs="Arial"/>
-          <w:color w:val="000000"/>
-        </w:rPr>
-        <w:t xml:space="preserve"> portabel, realisasi hasil rancangan hardware, aplikasi web dan mobile, pengujian dan kalibrasi akselerometer serta pengujian aplikasi web dan mobile untuk mendapatkan data hasil penelitian ini.</w:t>
+        <w:t xml:space="preserve">Pembahasan bagian ini meliputi realisasi </w:t>
+      </w:r>
+      <w:r>
+        <w:rPr>
+          <w:rFonts w:ascii="Arial" w:hAnsi="Arial" w:cs="Arial"/>
+          <w:color w:val="000000"/>
+          <w:lang w:val="en-US"/>
+        </w:rPr>
+        <w:t>pe</w:t>
+      </w:r>
+      <w:r>
+        <w:rPr>
+          <w:rFonts w:ascii="Arial" w:hAnsi="Arial" w:cs="Arial"/>
+          <w:color w:val="000000"/>
+        </w:rPr>
+        <w:t>rancangan hardware sistem, aplikasi web dan mobile.</w:t>
       </w:r>
     </w:p>
     <w:p>
@@ -20217,7 +20051,7 @@
           <w:rFonts w:ascii="Arial" w:hAnsi="Arial" w:cs="Arial"/>
           <w:color w:val="000000"/>
         </w:rPr>
-        <w:t>Implementasi Hasil Rancangan Hardware</w:t>
+        <w:t>Implementasi Rancangan Hardware</w:t>
       </w:r>
     </w:p>
     <w:p>
@@ -20231,34 +20065,6 @@
           <w:color w:val="000000"/>
         </w:rPr>
       </w:pPr>
-      <w:r>
-        <w:rPr>
-          <w:rFonts w:ascii="Arial" w:hAnsi="Arial" w:cs="Arial"/>
-          <w:color w:val="000000"/>
-        </w:rPr>
-        <w:t>Hasil dari perancangan hardware dapat dilihat pada gambar 1</w:t>
-      </w:r>
-      <w:r>
-        <w:rPr>
-          <w:rFonts w:ascii="Arial" w:hAnsi="Arial" w:cs="Arial"/>
-          <w:color w:val="000000"/>
-        </w:rPr>
-        <w:t>0</w:t>
-      </w:r>
-      <w:r>
-        <w:rPr>
-          <w:rFonts w:ascii="Arial" w:hAnsi="Arial" w:cs="Arial"/>
-          <w:color w:val="000000"/>
-        </w:rPr>
-        <w:t>.</w:t>
-      </w:r>
-      <w:r>
-        <w:rPr>
-          <w:rFonts w:ascii="Arial" w:hAnsi="Arial" w:cs="Arial"/>
-          <w:color w:val="000000"/>
-        </w:rPr>
-        <w:t xml:space="preserve"> </w:t>
-      </w:r>
       <w:r>
         <w:rPr>
           <w:rFonts w:ascii="Arial" w:hAnsi="Arial" w:cs="Arial"/>
@@ -20335,109 +20141,224 @@
         <w:rPr>
           <w:rFonts w:ascii="Arial" w:hAnsi="Arial" w:cs="Arial"/>
           <w:color w:val="000000"/>
+          <w:lang w:val="en-US"/>
         </w:rPr>
       </w:pPr>
-      <w:r>
-        <w:rPr>
-          <w:rFonts w:ascii="Arial" w:hAnsi="Arial" w:cs="Arial"/>
-          <w:color w:val="000000"/>
-        </w:rPr>
-        <w:lastRenderedPageBreak/>
-        <w:t xml:space="preserve">Hasil dari aplikasi website kemudian </w:t>
-      </w:r>
-      <w:proofErr w:type="spellStart"/>
-      <w:r>
-        <w:rPr>
-          <w:rFonts w:ascii="Arial" w:hAnsi="Arial" w:cs="Arial"/>
-          <w:color w:val="000000"/>
-        </w:rPr>
-        <w:t>diupload</w:t>
-      </w:r>
-      <w:proofErr w:type="spellEnd"/>
-      <w:r>
-        <w:rPr>
-          <w:rFonts w:ascii="Arial" w:hAnsi="Arial" w:cs="Arial"/>
-          <w:color w:val="000000"/>
-        </w:rPr>
-        <w:t xml:space="preserve"> ke server </w:t>
-      </w:r>
-      <w:proofErr w:type="spellStart"/>
-      <w:r>
-        <w:rPr>
-          <w:rFonts w:ascii="Arial" w:hAnsi="Arial" w:cs="Arial"/>
-          <w:color w:val="000000"/>
-        </w:rPr>
-        <w:t>hosting</w:t>
-      </w:r>
-      <w:proofErr w:type="spellEnd"/>
-      <w:r>
-        <w:rPr>
-          <w:rFonts w:ascii="Arial" w:hAnsi="Arial" w:cs="Arial"/>
-          <w:color w:val="000000"/>
-        </w:rPr>
-        <w:t xml:space="preserve"> agar dapat di akses. Sedangkan Aplikasi Mobile dapat </w:t>
-      </w:r>
-      <w:r>
-        <w:rPr>
-          <w:rFonts w:ascii="Arial" w:hAnsi="Arial" w:cs="Arial"/>
-          <w:color w:val="000000"/>
-        </w:rPr>
-        <w:t xml:space="preserve">di </w:t>
-      </w:r>
-      <w:proofErr w:type="spellStart"/>
-      <w:r>
-        <w:rPr>
-          <w:rFonts w:ascii="Arial" w:hAnsi="Arial" w:cs="Arial"/>
-          <w:color w:val="000000"/>
-        </w:rPr>
-        <w:t>install</w:t>
-      </w:r>
-      <w:proofErr w:type="spellEnd"/>
-      <w:r>
-        <w:rPr>
-          <w:rFonts w:ascii="Arial" w:hAnsi="Arial" w:cs="Arial"/>
-          <w:color w:val="000000"/>
-        </w:rPr>
-        <w:t xml:space="preserve"> pada </w:t>
-      </w:r>
-      <w:proofErr w:type="spellStart"/>
-      <w:r>
-        <w:rPr>
-          <w:rFonts w:ascii="Arial" w:hAnsi="Arial" w:cs="Arial"/>
-          <w:color w:val="000000"/>
-        </w:rPr>
-        <w:t>Smartphone</w:t>
-      </w:r>
-      <w:proofErr w:type="spellEnd"/>
-      <w:r>
-        <w:rPr>
-          <w:rFonts w:ascii="Arial" w:hAnsi="Arial" w:cs="Arial"/>
-          <w:color w:val="000000"/>
-        </w:rPr>
-        <w:t xml:space="preserve"> Android maupun iPhone </w:t>
-      </w:r>
-      <w:proofErr w:type="spellStart"/>
-      <w:r>
-        <w:rPr>
-          <w:rFonts w:ascii="Arial" w:hAnsi="Arial" w:cs="Arial"/>
-          <w:color w:val="000000"/>
-        </w:rPr>
-        <w:t>iOS</w:t>
-      </w:r>
-      <w:proofErr w:type="spellEnd"/>
-      <w:r>
-        <w:rPr>
-          <w:rFonts w:ascii="Arial" w:hAnsi="Arial" w:cs="Arial"/>
-          <w:color w:val="000000"/>
-        </w:rPr>
-        <w:t>, Hasil Dari Aplikasi ini dapat dilihat pada Gambar 1</w:t>
-      </w:r>
-      <w:r>
-        <w:rPr>
-          <w:rFonts w:ascii="Arial" w:hAnsi="Arial" w:cs="Arial"/>
-          <w:color w:val="000000"/>
-        </w:rPr>
-        <w:t>1 dan 12</w:t>
+      <w:proofErr w:type="spellStart"/>
+      <w:r>
+        <w:rPr>
+          <w:rFonts w:ascii="Arial" w:hAnsi="Arial" w:cs="Arial"/>
+          <w:color w:val="000000"/>
+          <w:lang w:val="en-US"/>
+        </w:rPr>
+        <w:t>Aplikasi</w:t>
+      </w:r>
+      <w:proofErr w:type="spellEnd"/>
+      <w:r>
+        <w:rPr>
+          <w:rFonts w:ascii="Arial" w:hAnsi="Arial" w:cs="Arial"/>
+          <w:color w:val="000000"/>
+          <w:lang w:val="en-US"/>
+        </w:rPr>
+        <w:t xml:space="preserve"> website </w:t>
+      </w:r>
+      <w:proofErr w:type="spellStart"/>
+      <w:r>
+        <w:rPr>
+          <w:rFonts w:ascii="Arial" w:hAnsi="Arial" w:cs="Arial"/>
+          <w:color w:val="000000"/>
+          <w:lang w:val="en-US"/>
+        </w:rPr>
+        <w:t>disimpan</w:t>
+      </w:r>
+      <w:proofErr w:type="spellEnd"/>
+      <w:r>
+        <w:rPr>
+          <w:rFonts w:ascii="Arial" w:hAnsi="Arial" w:cs="Arial"/>
+          <w:color w:val="000000"/>
+          <w:lang w:val="en-US"/>
+        </w:rPr>
+        <w:t xml:space="preserve"> </w:t>
+      </w:r>
+      <w:proofErr w:type="spellStart"/>
+      <w:r>
+        <w:rPr>
+          <w:rFonts w:ascii="Arial" w:hAnsi="Arial" w:cs="Arial"/>
+          <w:color w:val="000000"/>
+          <w:lang w:val="en-US"/>
+        </w:rPr>
+        <w:t>dalam</w:t>
+      </w:r>
+      <w:proofErr w:type="spellEnd"/>
+      <w:r>
+        <w:rPr>
+          <w:rFonts w:ascii="Arial" w:hAnsi="Arial" w:cs="Arial"/>
+          <w:color w:val="000000"/>
+          <w:lang w:val="en-US"/>
+        </w:rPr>
+        <w:t xml:space="preserve"> server hosting yang optimal di </w:t>
+      </w:r>
+      <w:proofErr w:type="spellStart"/>
+      <w:r>
+        <w:rPr>
+          <w:rFonts w:ascii="Arial" w:hAnsi="Arial" w:cs="Arial"/>
+          <w:color w:val="000000"/>
+          <w:lang w:val="en-US"/>
+        </w:rPr>
+        <w:t>akses</w:t>
+      </w:r>
+      <w:proofErr w:type="spellEnd"/>
+      <w:r>
+        <w:rPr>
+          <w:rFonts w:ascii="Arial" w:hAnsi="Arial" w:cs="Arial"/>
+          <w:color w:val="000000"/>
+          <w:lang w:val="en-US"/>
+        </w:rPr>
+        <w:t xml:space="preserve"> </w:t>
+      </w:r>
+      <w:proofErr w:type="spellStart"/>
+      <w:r>
+        <w:rPr>
+          <w:rFonts w:ascii="Arial" w:hAnsi="Arial" w:cs="Arial"/>
+          <w:color w:val="000000"/>
+          <w:lang w:val="en-US"/>
+        </w:rPr>
+        <w:t>menggunakan</w:t>
+      </w:r>
+      <w:proofErr w:type="spellEnd"/>
+      <w:r>
+        <w:rPr>
+          <w:rFonts w:ascii="Arial" w:hAnsi="Arial" w:cs="Arial"/>
+          <w:color w:val="000000"/>
+          <w:lang w:val="en-US"/>
+        </w:rPr>
+        <w:t xml:space="preserve"> browser chrome </w:t>
+      </w:r>
+      <w:proofErr w:type="spellStart"/>
+      <w:r>
+        <w:rPr>
+          <w:rFonts w:ascii="Arial" w:hAnsi="Arial" w:cs="Arial"/>
+          <w:color w:val="000000"/>
+          <w:lang w:val="en-US"/>
+        </w:rPr>
+        <w:t>ataupun</w:t>
+      </w:r>
+      <w:proofErr w:type="spellEnd"/>
+      <w:r>
+        <w:rPr>
+          <w:rFonts w:ascii="Arial" w:hAnsi="Arial" w:cs="Arial"/>
+          <w:color w:val="000000"/>
+          <w:lang w:val="en-US"/>
+        </w:rPr>
+        <w:t xml:space="preserve"> </w:t>
+      </w:r>
+      <w:proofErr w:type="spellStart"/>
+      <w:r>
+        <w:rPr>
+          <w:rFonts w:ascii="Arial" w:hAnsi="Arial" w:cs="Arial"/>
+          <w:color w:val="000000"/>
+          <w:lang w:val="en-US"/>
+        </w:rPr>
+        <w:t>firefox</w:t>
+      </w:r>
+      <w:proofErr w:type="spellEnd"/>
+      <w:r>
+        <w:rPr>
+          <w:rFonts w:ascii="Arial" w:hAnsi="Arial" w:cs="Arial"/>
+          <w:color w:val="000000"/>
+          <w:lang w:val="en-US"/>
+        </w:rPr>
+        <w:t xml:space="preserve">. </w:t>
+      </w:r>
+      <w:proofErr w:type="spellStart"/>
+      <w:r>
+        <w:rPr>
+          <w:rFonts w:ascii="Arial" w:hAnsi="Arial" w:cs="Arial"/>
+          <w:color w:val="000000"/>
+          <w:lang w:val="en-US"/>
+        </w:rPr>
+        <w:t>Aplikasi</w:t>
+      </w:r>
+      <w:proofErr w:type="spellEnd"/>
+      <w:r>
+        <w:rPr>
+          <w:rFonts w:ascii="Arial" w:hAnsi="Arial" w:cs="Arial"/>
+          <w:color w:val="000000"/>
+          <w:lang w:val="en-US"/>
+        </w:rPr>
+        <w:t xml:space="preserve"> mobile </w:t>
+      </w:r>
+      <w:proofErr w:type="spellStart"/>
+      <w:r>
+        <w:rPr>
+          <w:rFonts w:ascii="Arial" w:hAnsi="Arial" w:cs="Arial"/>
+          <w:color w:val="000000"/>
+          <w:lang w:val="en-US"/>
+        </w:rPr>
+        <w:t>dapat</w:t>
+      </w:r>
+      <w:proofErr w:type="spellEnd"/>
+      <w:r>
+        <w:rPr>
+          <w:rFonts w:ascii="Arial" w:hAnsi="Arial" w:cs="Arial"/>
+          <w:color w:val="000000"/>
+          <w:lang w:val="en-US"/>
+        </w:rPr>
+        <w:t xml:space="preserve"> di install pada system </w:t>
+      </w:r>
+      <w:proofErr w:type="spellStart"/>
+      <w:r>
+        <w:rPr>
+          <w:rFonts w:ascii="Arial" w:hAnsi="Arial" w:cs="Arial"/>
+          <w:color w:val="000000"/>
+          <w:lang w:val="en-US"/>
+        </w:rPr>
+        <w:t>operasi</w:t>
+      </w:r>
+      <w:proofErr w:type="spellEnd"/>
+      <w:r>
+        <w:rPr>
+          <w:rFonts w:ascii="Arial" w:hAnsi="Arial" w:cs="Arial"/>
+          <w:color w:val="000000"/>
+          <w:lang w:val="en-US"/>
+        </w:rPr>
+        <w:t xml:space="preserve"> </w:t>
+      </w:r>
+      <w:proofErr w:type="spellStart"/>
+      <w:r>
+        <w:rPr>
+          <w:rFonts w:ascii="Arial" w:hAnsi="Arial" w:cs="Arial"/>
+          <w:color w:val="000000"/>
+          <w:lang w:val="en-US"/>
+        </w:rPr>
+        <w:t>Andorid</w:t>
+      </w:r>
+      <w:proofErr w:type="spellEnd"/>
+      <w:r>
+        <w:rPr>
+          <w:rFonts w:ascii="Arial" w:hAnsi="Arial" w:cs="Arial"/>
+          <w:color w:val="000000"/>
+          <w:lang w:val="en-US"/>
+        </w:rPr>
+        <w:t xml:space="preserve"> </w:t>
+      </w:r>
+      <w:proofErr w:type="spellStart"/>
+      <w:r>
+        <w:rPr>
+          <w:rFonts w:ascii="Arial" w:hAnsi="Arial" w:cs="Arial"/>
+          <w:color w:val="000000"/>
+          <w:lang w:val="en-US"/>
+        </w:rPr>
+        <w:t>ataupun</w:t>
+      </w:r>
+      <w:proofErr w:type="spellEnd"/>
+      <w:r>
+        <w:rPr>
+          <w:rFonts w:ascii="Arial" w:hAnsi="Arial" w:cs="Arial"/>
+          <w:color w:val="000000"/>
+          <w:lang w:val="en-US"/>
+        </w:rPr>
+        <w:t xml:space="preserve"> iOS.</w:t>
       </w:r>
     </w:p>
     <w:p>
@@ -20500,6 +20421,7 @@
                 <w:noProof/>
                 <w:color w:val="000000"/>
               </w:rPr>
+              <w:lastRenderedPageBreak/>
               <w:drawing>
                 <wp:inline distT="0" distB="0" distL="0" distR="0" wp14:anchorId="061E889C" wp14:editId="5C6B855D">
                   <wp:extent cx="2729230" cy="1790700"/>
@@ -20516,7 +20438,7 @@
                           <pic:cNvPicPr/>
                         </pic:nvPicPr>
                         <pic:blipFill>
-                          <a:blip r:embed="rId31"/>
+                          <a:blip r:embed="rId28"/>
                           <a:stretch>
                             <a:fillRect/>
                           </a:stretch>
@@ -20582,7 +20504,22 @@
                 <w:rFonts w:ascii="Arial" w:hAnsi="Arial" w:cs="Arial"/>
                 <w:color w:val="000000"/>
               </w:rPr>
-              <w:t xml:space="preserve">. Hasil </w:t>
+              <w:t xml:space="preserve">. </w:t>
+            </w:r>
+            <w:r>
+              <w:rPr>
+                <w:rFonts w:ascii="Arial" w:hAnsi="Arial" w:cs="Arial"/>
+                <w:color w:val="000000"/>
+                <w:lang w:val="en-US"/>
+              </w:rPr>
+              <w:t>Hardware</w:t>
+            </w:r>
+            <w:r>
+              <w:rPr>
+                <w:rFonts w:ascii="Arial" w:hAnsi="Arial" w:cs="Arial"/>
+                <w:color w:val="000000"/>
+              </w:rPr>
+              <w:t xml:space="preserve"> </w:t>
             </w:r>
             <w:proofErr w:type="spellStart"/>
             <w:r>
@@ -20637,7 +20574,7 @@
                     <pic:cNvPicPr/>
                   </pic:nvPicPr>
                   <pic:blipFill>
-                    <a:blip r:embed="rId32"/>
+                    <a:blip r:embed="rId29"/>
                     <a:stretch>
                       <a:fillRect/>
                     </a:stretch>
@@ -20684,7 +20621,7 @@
                     <pic:cNvPicPr/>
                   </pic:nvPicPr>
                   <pic:blipFill>
-                    <a:blip r:embed="rId33"/>
+                    <a:blip r:embed="rId30"/>
                     <a:stretch>
                       <a:fillRect/>
                     </a:stretch>
@@ -20822,7 +20759,7 @@
                     <pic:cNvPicPr/>
                   </pic:nvPicPr>
                   <pic:blipFill rotWithShape="1">
-                    <a:blip r:embed="rId34"/>
+                    <a:blip r:embed="rId31"/>
                     <a:srcRect l="9307" t="7988" r="9726" b="6629"/>
                     <a:stretch/>
                   </pic:blipFill>
@@ -20881,7 +20818,7 @@
                     <pic:cNvPicPr/>
                   </pic:nvPicPr>
                   <pic:blipFill rotWithShape="1">
-                    <a:blip r:embed="rId35"/>
+                    <a:blip r:embed="rId32"/>
                     <a:srcRect l="9073" t="8363" r="10191" b="6629"/>
                     <a:stretch/>
                   </pic:blipFill>
@@ -21076,59 +21013,6 @@
         </w:rPr>
         <w:t xml:space="preserve"> </w:t>
       </w:r>
-      <w:r>
-        <w:rPr>
-          <w:rFonts w:ascii="Arial" w:hAnsi="Arial" w:cs="Arial"/>
-          <w:color w:val="000000"/>
-        </w:rPr>
-        <w:t xml:space="preserve">Untuk pembuatan akun </w:t>
-      </w:r>
-      <w:r>
-        <w:rPr>
-          <w:rFonts w:ascii="Arial" w:hAnsi="Arial" w:cs="Arial"/>
-          <w:color w:val="000000"/>
-        </w:rPr>
-        <w:t xml:space="preserve">hanya dapat dilakukan oleh </w:t>
-      </w:r>
-      <w:proofErr w:type="spellStart"/>
-      <w:r>
-        <w:rPr>
-          <w:rFonts w:ascii="Arial" w:hAnsi="Arial" w:cs="Arial"/>
-          <w:color w:val="000000"/>
-        </w:rPr>
-        <w:t>admin</w:t>
-      </w:r>
-      <w:proofErr w:type="spellEnd"/>
-      <w:r>
-        <w:rPr>
-          <w:rFonts w:ascii="Arial" w:hAnsi="Arial" w:cs="Arial"/>
-          <w:color w:val="000000"/>
-        </w:rPr>
-        <w:t xml:space="preserve"> sehingga seluruh pengguna aplikasi dapat diketahui. </w:t>
-      </w:r>
-      <w:r>
-        <w:rPr>
-          <w:rFonts w:ascii="Arial" w:hAnsi="Arial" w:cs="Arial"/>
-          <w:color w:val="000000"/>
-        </w:rPr>
-        <w:t xml:space="preserve">Pengguna juga dapat melakukan reset </w:t>
-      </w:r>
-      <w:proofErr w:type="spellStart"/>
-      <w:r>
-        <w:rPr>
-          <w:rFonts w:ascii="Arial" w:hAnsi="Arial" w:cs="Arial"/>
-          <w:color w:val="000000"/>
-        </w:rPr>
-        <w:t>password</w:t>
-      </w:r>
-      <w:proofErr w:type="spellEnd"/>
-      <w:r>
-        <w:rPr>
-          <w:rFonts w:ascii="Arial" w:hAnsi="Arial" w:cs="Arial"/>
-          <w:color w:val="000000"/>
-        </w:rPr>
-        <w:t xml:space="preserve"> menggunakan email.</w:t>
-      </w:r>
     </w:p>
     <w:p>
       <w:pPr>
@@ -21145,273 +21029,59 @@
           <w:rFonts w:ascii="Arial" w:hAnsi="Arial" w:cs="Arial"/>
           <w:color w:val="000000"/>
         </w:rPr>
-        <w:t xml:space="preserve">Pada halaman utama aplikasi akan menampilkan Jarak pengguna dengan kendaraan </w:t>
-      </w:r>
-      <w:proofErr w:type="spellStart"/>
-      <w:r>
-        <w:rPr>
-          <w:rFonts w:ascii="Arial" w:hAnsi="Arial" w:cs="Arial"/>
-          <w:color w:val="000000"/>
-        </w:rPr>
-        <w:t>nya</w:t>
-      </w:r>
-      <w:proofErr w:type="spellEnd"/>
-      <w:r>
-        <w:rPr>
-          <w:rFonts w:ascii="Arial" w:hAnsi="Arial" w:cs="Arial"/>
-          <w:color w:val="000000"/>
-        </w:rPr>
-        <w:t>,</w:t>
-      </w:r>
-      <w:r>
-        <w:rPr>
-          <w:rFonts w:ascii="Arial" w:hAnsi="Arial" w:cs="Arial"/>
-          <w:color w:val="000000"/>
-        </w:rPr>
-        <w:t xml:space="preserve"> </w:t>
-      </w:r>
-      <w:proofErr w:type="spellStart"/>
-      <w:r>
-        <w:rPr>
-          <w:rFonts w:ascii="Arial" w:hAnsi="Arial" w:cs="Arial"/>
-          <w:color w:val="000000"/>
-        </w:rPr>
-        <w:t>list</w:t>
-      </w:r>
-      <w:proofErr w:type="spellEnd"/>
-      <w:r>
-        <w:rPr>
-          <w:rFonts w:ascii="Arial" w:hAnsi="Arial" w:cs="Arial"/>
-          <w:color w:val="000000"/>
-        </w:rPr>
-        <w:t xml:space="preserve"> koordinat </w:t>
-      </w:r>
-      <w:proofErr w:type="spellStart"/>
-      <w:r>
-        <w:rPr>
-          <w:rFonts w:ascii="Arial" w:hAnsi="Arial" w:cs="Arial"/>
-          <w:color w:val="000000"/>
-        </w:rPr>
-        <w:t>terkahir</w:t>
-      </w:r>
-      <w:proofErr w:type="spellEnd"/>
-      <w:r>
-        <w:rPr>
-          <w:rFonts w:ascii="Arial" w:hAnsi="Arial" w:cs="Arial"/>
-          <w:color w:val="000000"/>
-        </w:rPr>
-        <w:t xml:space="preserve"> beserta waktunya,</w:t>
-      </w:r>
-      <w:r>
-        <w:rPr>
-          <w:rFonts w:ascii="Arial" w:hAnsi="Arial" w:cs="Arial"/>
-          <w:color w:val="000000"/>
-        </w:rPr>
-        <w:t xml:space="preserve"> Status kendaraan, grafik sensor akselerometer dan juga kontrol panel </w:t>
-      </w:r>
-      <w:r>
-        <w:rPr>
-          <w:rFonts w:ascii="Arial" w:hAnsi="Arial" w:cs="Arial"/>
-          <w:color w:val="000000"/>
-        </w:rPr>
-        <w:lastRenderedPageBreak/>
-        <w:t xml:space="preserve">yang dapat digunakan </w:t>
-      </w:r>
-      <w:r>
-        <w:rPr>
-          <w:rFonts w:ascii="Arial" w:hAnsi="Arial" w:cs="Arial"/>
-          <w:color w:val="000000"/>
-        </w:rPr>
-        <w:t>untuk kendali jarak jauh</w:t>
-      </w:r>
-      <w:r>
-        <w:rPr>
-          <w:rFonts w:ascii="Arial" w:hAnsi="Arial" w:cs="Arial"/>
-          <w:color w:val="000000"/>
-        </w:rPr>
-        <w:t>.</w:t>
-      </w:r>
-      <w:r>
-        <w:rPr>
-          <w:rFonts w:ascii="Arial" w:hAnsi="Arial" w:cs="Arial"/>
-          <w:color w:val="000000"/>
-        </w:rPr>
-        <w:t xml:space="preserve"> </w:t>
+        <w:t xml:space="preserve">Untuk pembuatan akun hanya dapat dilakukan oleh </w:t>
+      </w:r>
+      <w:proofErr w:type="spellStart"/>
+      <w:r>
+        <w:rPr>
+          <w:rFonts w:ascii="Arial" w:hAnsi="Arial" w:cs="Arial"/>
+          <w:color w:val="000000"/>
+        </w:rPr>
+        <w:t>admin</w:t>
+      </w:r>
+      <w:proofErr w:type="spellEnd"/>
+      <w:r>
+        <w:rPr>
+          <w:rFonts w:ascii="Arial" w:hAnsi="Arial" w:cs="Arial"/>
+          <w:color w:val="000000"/>
+        </w:rPr>
+        <w:t xml:space="preserve"> sehingga seluruh </w:t>
+      </w:r>
+      <w:r>
+        <w:rPr>
+          <w:rFonts w:ascii="Arial" w:hAnsi="Arial" w:cs="Arial"/>
+          <w:color w:val="000000"/>
+        </w:rPr>
+        <w:t xml:space="preserve">pengguna aplikasi dapat diketahui. </w:t>
+      </w:r>
+      <w:r>
+        <w:rPr>
+          <w:rFonts w:ascii="Arial" w:hAnsi="Arial" w:cs="Arial"/>
+          <w:color w:val="000000"/>
+        </w:rPr>
+        <w:t xml:space="preserve">Pengguna juga dapat melakukan reset </w:t>
+      </w:r>
+      <w:proofErr w:type="spellStart"/>
+      <w:r>
+        <w:rPr>
+          <w:rFonts w:ascii="Arial" w:hAnsi="Arial" w:cs="Arial"/>
+          <w:color w:val="000000"/>
+        </w:rPr>
+        <w:t>password</w:t>
+      </w:r>
+      <w:proofErr w:type="spellEnd"/>
+      <w:r>
+        <w:rPr>
+          <w:rFonts w:ascii="Arial" w:hAnsi="Arial" w:cs="Arial"/>
+          <w:color w:val="000000"/>
+        </w:rPr>
+        <w:t xml:space="preserve"> menggunakan email.</w:t>
       </w:r>
     </w:p>
     <w:p>
       <w:pPr>
-        <w:pStyle w:val="ListParagraph"/>
-        <w:numPr>
-          <w:ilvl w:val="0"/>
-          <w:numId w:val="5"/>
-        </w:numPr>
-        <w:spacing w:after="0" w:line="240" w:lineRule="auto"/>
-        <w:ind w:left="284" w:hanging="284"/>
-        <w:jc w:val="both"/>
-        <w:rPr>
-          <w:rFonts w:ascii="Arial" w:hAnsi="Arial" w:cs="Arial"/>
-          <w:color w:val="000000"/>
-        </w:rPr>
-      </w:pPr>
-      <w:r>
-        <w:rPr>
-          <w:rFonts w:ascii="Arial" w:hAnsi="Arial" w:cs="Arial"/>
-          <w:color w:val="000000"/>
-        </w:rPr>
-        <w:t xml:space="preserve">Integrasi </w:t>
-      </w:r>
-      <w:r>
-        <w:rPr>
-          <w:rFonts w:ascii="Arial" w:hAnsi="Arial" w:cs="Arial"/>
-          <w:color w:val="000000"/>
-        </w:rPr>
-        <w:t>hardware dan aplikasi</w:t>
-      </w:r>
-    </w:p>
-    <w:p>
-      <w:pPr>
-        <w:pStyle w:val="ListParagraph"/>
-        <w:spacing w:after="0" w:line="240" w:lineRule="auto"/>
-        <w:ind w:left="284"/>
-        <w:jc w:val="both"/>
-        <w:rPr>
-          <w:rFonts w:ascii="Arial" w:hAnsi="Arial" w:cs="Arial"/>
-          <w:color w:val="000000"/>
-        </w:rPr>
-      </w:pPr>
-      <w:r>
-        <w:rPr>
-          <w:rFonts w:ascii="Arial" w:hAnsi="Arial" w:cs="Arial"/>
-          <w:color w:val="000000"/>
-        </w:rPr>
-        <w:t xml:space="preserve">Dalam melakukan integrasi aplikasi dan hardware </w:t>
-      </w:r>
-      <w:r>
-        <w:rPr>
-          <w:rFonts w:ascii="Arial" w:hAnsi="Arial" w:cs="Arial"/>
-          <w:color w:val="000000"/>
-        </w:rPr>
-        <w:t xml:space="preserve">akan menggunakan API atau </w:t>
-      </w:r>
-      <w:proofErr w:type="spellStart"/>
-      <w:r>
-        <w:rPr>
-          <w:rFonts w:ascii="Arial" w:hAnsi="Arial" w:cs="Arial"/>
-          <w:i/>
-          <w:iCs/>
-          <w:color w:val="000000"/>
-        </w:rPr>
-        <w:t>Application</w:t>
-      </w:r>
-      <w:proofErr w:type="spellEnd"/>
-      <w:r>
-        <w:rPr>
-          <w:rFonts w:ascii="Arial" w:hAnsi="Arial" w:cs="Arial"/>
-          <w:i/>
-          <w:iCs/>
-          <w:color w:val="000000"/>
-        </w:rPr>
-        <w:t xml:space="preserve"> </w:t>
-      </w:r>
-      <w:proofErr w:type="spellStart"/>
-      <w:r>
-        <w:rPr>
-          <w:rFonts w:ascii="Arial" w:hAnsi="Arial" w:cs="Arial"/>
-          <w:i/>
-          <w:iCs/>
-          <w:color w:val="000000"/>
-        </w:rPr>
-        <w:t>Programming</w:t>
-      </w:r>
-      <w:proofErr w:type="spellEnd"/>
-      <w:r>
-        <w:rPr>
-          <w:rFonts w:ascii="Arial" w:hAnsi="Arial" w:cs="Arial"/>
-          <w:i/>
-          <w:iCs/>
-          <w:color w:val="000000"/>
-        </w:rPr>
-        <w:t xml:space="preserve"> Interface </w:t>
-      </w:r>
-      <w:r>
-        <w:rPr>
-          <w:rFonts w:ascii="Arial" w:hAnsi="Arial" w:cs="Arial"/>
-          <w:color w:val="000000"/>
-        </w:rPr>
-        <w:t xml:space="preserve">dengan metode </w:t>
-      </w:r>
-      <w:proofErr w:type="spellStart"/>
-      <w:r>
-        <w:rPr>
-          <w:rFonts w:ascii="Arial" w:hAnsi="Arial" w:cs="Arial"/>
-          <w:i/>
-          <w:iCs/>
-          <w:color w:val="000000"/>
-        </w:rPr>
-        <w:t>post</w:t>
-      </w:r>
-      <w:proofErr w:type="spellEnd"/>
-      <w:r>
-        <w:rPr>
-          <w:rFonts w:ascii="Arial" w:hAnsi="Arial" w:cs="Arial"/>
-          <w:color w:val="000000"/>
-        </w:rPr>
-        <w:t xml:space="preserve"> dan </w:t>
-      </w:r>
-      <w:proofErr w:type="spellStart"/>
-      <w:r>
-        <w:rPr>
-          <w:rFonts w:ascii="Arial" w:hAnsi="Arial" w:cs="Arial"/>
-          <w:i/>
-          <w:iCs/>
-          <w:color w:val="000000"/>
-        </w:rPr>
-        <w:t>seceret</w:t>
-      </w:r>
-      <w:proofErr w:type="spellEnd"/>
-      <w:r>
-        <w:rPr>
-          <w:rFonts w:ascii="Arial" w:hAnsi="Arial" w:cs="Arial"/>
-          <w:i/>
-          <w:iCs/>
-          <w:color w:val="000000"/>
-        </w:rPr>
-        <w:t xml:space="preserve"> </w:t>
-      </w:r>
-      <w:proofErr w:type="spellStart"/>
-      <w:r>
-        <w:rPr>
-          <w:rFonts w:ascii="Arial" w:hAnsi="Arial" w:cs="Arial"/>
-          <w:i/>
-          <w:iCs/>
-          <w:color w:val="000000"/>
-        </w:rPr>
-        <w:t>key</w:t>
-      </w:r>
-      <w:proofErr w:type="spellEnd"/>
-      <w:r>
-        <w:rPr>
-          <w:rFonts w:ascii="Arial" w:hAnsi="Arial" w:cs="Arial"/>
-          <w:i/>
-          <w:iCs/>
-          <w:color w:val="000000"/>
-        </w:rPr>
-        <w:t xml:space="preserve"> </w:t>
-      </w:r>
-      <w:r>
-        <w:rPr>
-          <w:rFonts w:ascii="Arial" w:hAnsi="Arial" w:cs="Arial"/>
-          <w:color w:val="000000"/>
-        </w:rPr>
-        <w:t>sehingga data yang dikirimkan tidak dapat diakses menggunakan web browser pada umumnya.</w:t>
-      </w:r>
-    </w:p>
-    <w:p>
-      <w:pPr>
-        <w:pStyle w:val="ListParagraph"/>
-        <w:spacing w:after="0" w:line="240" w:lineRule="auto"/>
-        <w:ind w:left="284"/>
+        <w:spacing w:after="60" w:line="240" w:lineRule="auto"/>
+        <w:ind w:firstLine="567"/>
         <w:jc w:val="both"/>
         <w:rPr>
           <w:rFonts w:ascii="Arial" w:hAnsi="Arial" w:cs="Arial"/>
@@ -21430,39 +21100,83 @@
           <w:rFonts w:ascii="Arial" w:hAnsi="Arial" w:cs="Arial"/>
           <w:color w:val="000000"/>
         </w:rPr>
-        <w:t xml:space="preserve">Untuk memaksimalkan </w:t>
-      </w:r>
-      <w:proofErr w:type="spellStart"/>
-      <w:r>
-        <w:rPr>
-          <w:rFonts w:ascii="Arial" w:hAnsi="Arial" w:cs="Arial"/>
-          <w:color w:val="000000"/>
-        </w:rPr>
-        <w:t>peformansi</w:t>
-      </w:r>
-      <w:proofErr w:type="spellEnd"/>
-      <w:r>
-        <w:rPr>
-          <w:rFonts w:ascii="Arial" w:hAnsi="Arial" w:cs="Arial"/>
-          <w:color w:val="000000"/>
-        </w:rPr>
-        <w:t xml:space="preserve"> API memberikan respons berupa </w:t>
-      </w:r>
-      <w:proofErr w:type="spellStart"/>
-      <w:r>
-        <w:rPr>
-          <w:rFonts w:ascii="Arial" w:hAnsi="Arial" w:cs="Arial"/>
-          <w:color w:val="000000"/>
-        </w:rPr>
-        <w:t>json</w:t>
-      </w:r>
-      <w:proofErr w:type="spellEnd"/>
-      <w:r>
-        <w:rPr>
-          <w:rFonts w:ascii="Arial" w:hAnsi="Arial" w:cs="Arial"/>
-          <w:color w:val="000000"/>
-        </w:rPr>
-        <w:t xml:space="preserve"> berisi array yang dapat diproses oleh hardware secara langsung</w:t>
+        <w:t xml:space="preserve">Pada halaman utama aplikasi akan menampilkan Jarak pengguna dengan kendaraan </w:t>
+      </w:r>
+      <w:proofErr w:type="spellStart"/>
+      <w:r>
+        <w:rPr>
+          <w:rFonts w:ascii="Arial" w:hAnsi="Arial" w:cs="Arial"/>
+          <w:color w:val="000000"/>
+        </w:rPr>
+        <w:t>nya</w:t>
+      </w:r>
+      <w:proofErr w:type="spellEnd"/>
+      <w:r>
+        <w:rPr>
+          <w:rFonts w:ascii="Arial" w:hAnsi="Arial" w:cs="Arial"/>
+          <w:color w:val="000000"/>
+        </w:rPr>
+        <w:t>,</w:t>
+      </w:r>
+      <w:r>
+        <w:rPr>
+          <w:rFonts w:ascii="Arial" w:hAnsi="Arial" w:cs="Arial"/>
+          <w:color w:val="000000"/>
+        </w:rPr>
+        <w:t xml:space="preserve"> </w:t>
+      </w:r>
+      <w:proofErr w:type="spellStart"/>
+      <w:r>
+        <w:rPr>
+          <w:rFonts w:ascii="Arial" w:hAnsi="Arial" w:cs="Arial"/>
+          <w:color w:val="000000"/>
+        </w:rPr>
+        <w:t>list</w:t>
+      </w:r>
+      <w:proofErr w:type="spellEnd"/>
+      <w:r>
+        <w:rPr>
+          <w:rFonts w:ascii="Arial" w:hAnsi="Arial" w:cs="Arial"/>
+          <w:color w:val="000000"/>
+        </w:rPr>
+        <w:t xml:space="preserve"> koordinat </w:t>
+      </w:r>
+      <w:proofErr w:type="spellStart"/>
+      <w:r>
+        <w:rPr>
+          <w:rFonts w:ascii="Arial" w:hAnsi="Arial" w:cs="Arial"/>
+          <w:color w:val="000000"/>
+        </w:rPr>
+        <w:t>terkahir</w:t>
+      </w:r>
+      <w:proofErr w:type="spellEnd"/>
+      <w:r>
+        <w:rPr>
+          <w:rFonts w:ascii="Arial" w:hAnsi="Arial" w:cs="Arial"/>
+          <w:color w:val="000000"/>
+        </w:rPr>
+        <w:t xml:space="preserve"> beserta waktunya,</w:t>
+      </w:r>
+      <w:r>
+        <w:rPr>
+          <w:rFonts w:ascii="Arial" w:hAnsi="Arial" w:cs="Arial"/>
+          <w:color w:val="000000"/>
+        </w:rPr>
+        <w:t xml:space="preserve"> Status kendaraan, grafik sensor akselerometer dan juga kontrol panel </w:t>
+      </w:r>
+      <w:r>
+        <w:rPr>
+          <w:rFonts w:ascii="Arial" w:hAnsi="Arial" w:cs="Arial"/>
+          <w:color w:val="000000"/>
+        </w:rPr>
+        <w:t xml:space="preserve">yang dapat digunakan </w:t>
+      </w:r>
+      <w:r>
+        <w:rPr>
+          <w:rFonts w:ascii="Arial" w:hAnsi="Arial" w:cs="Arial"/>
+          <w:color w:val="000000"/>
+        </w:rPr>
+        <w:t>untuk kendali jarak jauh</w:t>
       </w:r>
       <w:r>
         <w:rPr>
@@ -21470,6 +21184,13 @@
           <w:color w:val="000000"/>
         </w:rPr>
         <w:t>.</w:t>
+      </w:r>
+      <w:r>
+        <w:rPr>
+          <w:rFonts w:ascii="Arial" w:hAnsi="Arial" w:cs="Arial"/>
+          <w:color w:val="000000"/>
+        </w:rPr>
+        <w:t xml:space="preserve"> </w:t>
       </w:r>
     </w:p>
     <w:p>
@@ -21517,7 +21238,6 @@
           <w:rFonts w:ascii="Arial" w:hAnsi="Arial" w:cs="Arial"/>
         </w:rPr>
       </w:pPr>
-      <w:commentRangeStart w:id="17"/>
       <w:r>
         <w:rPr>
           <w:rFonts w:ascii="Arial" w:hAnsi="Arial" w:cs="Arial"/>
@@ -21525,14 +21245,8 @@
           <w:bCs/>
           <w:spacing w:val="-1"/>
         </w:rPr>
+        <w:lastRenderedPageBreak/>
         <w:t>SIMPULAN</w:t>
-      </w:r>
-      <w:commentRangeEnd w:id="17"/>
-      <w:r>
-        <w:rPr>
-          <w:rStyle w:val="CommentReference"/>
-        </w:rPr>
-        <w:commentReference w:id="17"/>
       </w:r>
     </w:p>
     <w:p>
@@ -21567,23 +21281,7 @@
           <w:rFonts w:ascii="Arial" w:hAnsi="Arial" w:cs="Arial"/>
           <w:spacing w:val="-1"/>
         </w:rPr>
-        <w:t xml:space="preserve"> lx6 </w:t>
-      </w:r>
-      <w:proofErr w:type="spellStart"/>
-      <w:r>
-        <w:rPr>
-          <w:rFonts w:ascii="Arial" w:hAnsi="Arial" w:cs="Arial"/>
-          <w:spacing w:val="-1"/>
-        </w:rPr>
-        <w:t>dual</w:t>
-      </w:r>
-      <w:proofErr w:type="spellEnd"/>
-      <w:r>
-        <w:rPr>
-          <w:rFonts w:ascii="Arial" w:hAnsi="Arial" w:cs="Arial"/>
-          <w:spacing w:val="-1"/>
-        </w:rPr>
-        <w:t xml:space="preserve"> core</w:t>
+        <w:t xml:space="preserve"> lx6 dual core</w:t>
       </w:r>
       <w:r>
         <w:rPr>
@@ -21650,23 +21348,7 @@
           <w:rFonts w:ascii="Arial" w:hAnsi="Arial" w:cs="Arial"/>
           <w:spacing w:val="-1"/>
         </w:rPr>
-        <w:t xml:space="preserve"> Penggunaan mikroprosesor </w:t>
-      </w:r>
-      <w:proofErr w:type="spellStart"/>
-      <w:r>
-        <w:rPr>
-          <w:rFonts w:ascii="Arial" w:hAnsi="Arial" w:cs="Arial"/>
-          <w:spacing w:val="-1"/>
-        </w:rPr>
-        <w:t>dual</w:t>
-      </w:r>
-      <w:proofErr w:type="spellEnd"/>
-      <w:r>
-        <w:rPr>
-          <w:rFonts w:ascii="Arial" w:hAnsi="Arial" w:cs="Arial"/>
-          <w:spacing w:val="-1"/>
-        </w:rPr>
-        <w:t xml:space="preserve"> core akan sangat </w:t>
+        <w:t xml:space="preserve"> Penggunaan mikroprosesor dual core akan sangat </w:t>
       </w:r>
       <w:proofErr w:type="spellStart"/>
       <w:r>
@@ -21782,23 +21464,7 @@
           <w:rFonts w:ascii="Arial" w:hAnsi="Arial" w:cs="Arial"/>
           <w:spacing w:val="-1"/>
         </w:rPr>
-        <w:t xml:space="preserve"> ke database </w:t>
-      </w:r>
-      <w:proofErr w:type="spellStart"/>
-      <w:r>
-        <w:rPr>
-          <w:rFonts w:ascii="Arial" w:hAnsi="Arial" w:cs="Arial"/>
-          <w:spacing w:val="-1"/>
-        </w:rPr>
-        <w:t>online</w:t>
-      </w:r>
-      <w:proofErr w:type="spellEnd"/>
-      <w:r>
-        <w:rPr>
-          <w:rFonts w:ascii="Arial" w:hAnsi="Arial" w:cs="Arial"/>
-          <w:spacing w:val="-1"/>
-        </w:rPr>
-        <w:t xml:space="preserve"> dengan lokasi sebenarnya memiliki radius 18</w:t>
+        <w:t xml:space="preserve"> ke database online dengan lokasi sebenarnya memiliki radius 18</w:t>
       </w:r>
       <w:r>
         <w:rPr>
@@ -21978,23 +21644,7 @@
           <w:rFonts w:ascii="Arial" w:hAnsi="Arial" w:cs="Arial"/>
           <w:spacing w:val="-1"/>
         </w:rPr>
-        <w:t xml:space="preserve"> sesaat setelah terjadi perubahan kemiringan lalu mengirimkan data ke database </w:t>
-      </w:r>
-      <w:proofErr w:type="spellStart"/>
-      <w:r>
-        <w:rPr>
-          <w:rFonts w:ascii="Arial" w:hAnsi="Arial" w:cs="Arial"/>
-          <w:spacing w:val="-1"/>
-        </w:rPr>
-        <w:t>online</w:t>
-      </w:r>
-      <w:proofErr w:type="spellEnd"/>
-      <w:r>
-        <w:rPr>
-          <w:rFonts w:ascii="Arial" w:hAnsi="Arial" w:cs="Arial"/>
-          <w:spacing w:val="-1"/>
-        </w:rPr>
-        <w:t xml:space="preserve"> yang dapat diakses pengguna melalui aplikasi mobile </w:t>
+        <w:t xml:space="preserve"> sesaat setelah terjadi perubahan kemiringan lalu mengirimkan data ke database online yang dapat diakses pengguna melalui aplikasi mobile </w:t>
       </w:r>
       <w:proofErr w:type="spellStart"/>
       <w:r>
@@ -22058,23 +21708,7 @@
           <w:rFonts w:ascii="Arial" w:hAnsi="Arial" w:cs="Arial"/>
           <w:spacing w:val="-1"/>
         </w:rPr>
-        <w:t xml:space="preserve"> </w:t>
-      </w:r>
-      <w:proofErr w:type="spellStart"/>
-      <w:r>
-        <w:rPr>
-          <w:rFonts w:ascii="Arial" w:hAnsi="Arial" w:cs="Arial"/>
-          <w:spacing w:val="-1"/>
-        </w:rPr>
-        <w:t>delay</w:t>
-      </w:r>
-      <w:proofErr w:type="spellEnd"/>
-      <w:r>
-        <w:rPr>
-          <w:rFonts w:ascii="Arial" w:hAnsi="Arial" w:cs="Arial"/>
-          <w:spacing w:val="-1"/>
-        </w:rPr>
-        <w:t xml:space="preserve"> 3.96 detik.</w:t>
+        <w:t xml:space="preserve"> delay 3.96 detik.</w:t>
       </w:r>
     </w:p>
     <w:p>
@@ -23155,15 +22789,7 @@
           <w:noProof/>
           <w:lang w:val="en-US"/>
         </w:rPr>
-        <w:t xml:space="preserve">Ahuja, P., &amp; Bhavsar, K. (2018). Microcontroller Based Smart Helmet </w:t>
-      </w:r>
-      <w:r>
-        <w:rPr>
-          <w:rFonts w:ascii="Arial" w:hAnsi="Arial" w:cs="Arial"/>
-          <w:noProof/>
-          <w:lang w:val="en-US"/>
-        </w:rPr>
-        <w:t xml:space="preserve">Using GSM &amp; GPRS. </w:t>
+        <w:t xml:space="preserve">Ahuja, P., &amp; Bhavsar, K. (2018). Microcontroller Based Smart Helmet Using GSM &amp; GPRS. </w:t>
       </w:r>
       <w:r>
         <w:rPr>
@@ -23273,18 +22899,7 @@
           <w:noProof/>
           <w:lang w:val="en-US"/>
         </w:rPr>
-        <w:t xml:space="preserve">Proceedings of 2019 International Conference on </w:t>
-      </w:r>
-      <w:r>
-        <w:rPr>
-          <w:rFonts w:ascii="Arial" w:hAnsi="Arial" w:cs="Arial"/>
-          <w:i/>
-          <w:iCs/>
-          <w:noProof/>
-          <w:lang w:val="en-US"/>
-        </w:rPr>
-        <w:lastRenderedPageBreak/>
-        <w:t>Computational Intelligence and Knowledge Economy, ICCIKE 2019</w:t>
+        <w:t>Proceedings of 2019 International Conference on Computational Intelligence and Knowledge Economy, ICCIKE 2019</w:t>
       </w:r>
       <w:r>
         <w:rPr>
@@ -23374,7 +22989,16 @@
           <w:noProof/>
           <w:lang w:val="en-US"/>
         </w:rPr>
-        <w:t>. Badan Pusat Statistik. https://www.bps.go.id/publication/2018/12/26/89c06f465f944f3be39006a1/statistik-kriminal-2018.html</w:t>
+        <w:t>. Badan Pusat Statistik. https://www.bps.go.id/publication/2018/12/26/89c06f465f944f3be39006a1/stati</w:t>
+      </w:r>
+      <w:r>
+        <w:rPr>
+          <w:rFonts w:ascii="Arial" w:hAnsi="Arial" w:cs="Arial"/>
+          <w:noProof/>
+          <w:lang w:val="en-US"/>
+        </w:rPr>
+        <w:lastRenderedPageBreak/>
+        <w:t>stik-kriminal-2018.html</w:t>
       </w:r>
     </w:p>
     <w:p>
@@ -23556,15 +23180,7 @@
           <w:noProof/>
           <w:lang w:val="en-US"/>
         </w:rPr>
-        <w:t xml:space="preserve">, </w:t>
-      </w:r>
-      <w:r>
-        <w:rPr>
-          <w:rFonts w:ascii="Arial" w:hAnsi="Arial" w:cs="Arial"/>
-          <w:noProof/>
-          <w:lang w:val="en-US"/>
-        </w:rPr>
-        <w:t>1–5. https://doi.org/10.1109/ICSIMA.2018.8688783</w:t>
+        <w:t>, 1–5. https://doi.org/10.1109/ICSIMA.2018.8688783</w:t>
       </w:r>
     </w:p>
     <w:p>
@@ -23687,7 +23303,15 @@
           <w:noProof/>
           <w:lang w:val="en-US"/>
         </w:rPr>
-        <w:t xml:space="preserve">Ibraheem, I. K., &amp; Hadi, S. W. (2018). Design and Implementation of a Low-Cost Secure Vehicle Tracking System. </w:t>
+        <w:t>Ibraheem, I. K., &amp; Hadi, S. W. (2018). Design and Implementation of a Low-</w:t>
+      </w:r>
+      <w:r>
+        <w:rPr>
+          <w:rFonts w:ascii="Arial" w:hAnsi="Arial" w:cs="Arial"/>
+          <w:noProof/>
+          <w:lang w:val="en-US"/>
+        </w:rPr>
+        <w:t xml:space="preserve">Cost Secure Vehicle Tracking System. </w:t>
       </w:r>
       <w:r>
         <w:rPr>
@@ -23897,7 +23521,6 @@
           <w:noProof/>
           <w:lang w:val="en-US"/>
         </w:rPr>
-        <w:lastRenderedPageBreak/>
         <w:t>International Conference on Current Trends in Computer, Electrical, Electronics and Communication, CTCEEC 2017</w:t>
       </w:r>
       <w:r>
@@ -23970,7 +23593,16 @@
           <w:noProof/>
           <w:lang w:val="en-US"/>
         </w:rPr>
-        <w:t xml:space="preserve">Mustafa, A., A al-Nouman, M. I., &amp; Awad, O. A. (2019). A Smart real-time tracking system using GSM/GPRS technologies. </w:t>
+        <w:t xml:space="preserve">Mustafa, A., A al-Nouman, M. I., &amp; Awad, O. A. (2019). A Smart real-time tracking system using GSM/GPRS </w:t>
+      </w:r>
+      <w:r>
+        <w:rPr>
+          <w:rFonts w:ascii="Arial" w:hAnsi="Arial" w:cs="Arial"/>
+          <w:noProof/>
+          <w:lang w:val="en-US"/>
+        </w:rPr>
+        <w:lastRenderedPageBreak/>
+        <w:t xml:space="preserve">technologies. </w:t>
       </w:r>
       <w:r>
         <w:rPr>
@@ -24170,15 +23802,7 @@
           <w:noProof/>
           <w:lang w:val="en-US"/>
         </w:rPr>
-        <w:t xml:space="preserve">Rosyid, A., Budi, A. S., &amp; Susilo, P. H. (2020). Kontrol Sistem Starter Sepeda </w:t>
-      </w:r>
-      <w:r>
-        <w:rPr>
-          <w:rFonts w:ascii="Arial" w:hAnsi="Arial" w:cs="Arial"/>
-          <w:noProof/>
-          <w:lang w:val="en-US"/>
-        </w:rPr>
-        <w:t xml:space="preserve">Motor Berbasis Mikrokontroler Dengan Smartphone Android Menggunakan Voice Recognition. </w:t>
+        <w:t xml:space="preserve">Rosyid, A., Budi, A. S., &amp; Susilo, P. H. (2020). Kontrol Sistem Starter Sepeda Motor Berbasis Mikrokontroler Dengan Smartphone Android Menggunakan Voice Recognition. </w:t>
       </w:r>
       <w:r>
         <w:rPr>
@@ -24296,7 +23920,15 @@
           <w:noProof/>
           <w:lang w:val="en-US"/>
         </w:rPr>
-        <w:t xml:space="preserve">Satyamarda, F. W., Priyadmaji, N., Nugroho, W., &amp; Wirawan, B. (2021). Multimedia Vehicular Smartphone Docking with GPS Tracking. </w:t>
+        <w:t xml:space="preserve">Satyamarda, F. W., Priyadmaji, N., </w:t>
+      </w:r>
+      <w:r>
+        <w:rPr>
+          <w:rFonts w:ascii="Arial" w:hAnsi="Arial" w:cs="Arial"/>
+          <w:noProof/>
+          <w:lang w:val="en-US"/>
+        </w:rPr>
+        <w:t xml:space="preserve">Nugroho, W., &amp; Wirawan, B. (2021). Multimedia Vehicular Smartphone Docking with GPS Tracking. </w:t>
       </w:r>
       <w:r>
         <w:rPr>
@@ -24564,270 +24196,6 @@
     </w:sectPr>
   </w:body>
 </w:document>
-</file>
-
-<file path=word/comments.xml><?xml version="1.0" encoding="utf-8"?>
-<w:comments xmlns:wpc="http://schemas.microsoft.com/office/word/2010/wordprocessingCanvas" xmlns:cx="http://schemas.microsoft.com/office/drawing/2014/chartex" xmlns:cx1="http://schemas.microsoft.com/office/drawing/2015/9/8/chartex" xmlns:cx2="http://schemas.microsoft.com/office/drawing/2015/10/21/chartex" xmlns:cx3="http://schemas.microsoft.com/office/drawing/2016/5/9/chartex" xmlns:cx4="http://schemas.microsoft.com/office/drawing/2016/5/10/chartex" xmlns:cx5="http://schemas.microsoft.com/office/drawing/2016/5/11/chartex" xmlns:cx6="http://schemas.microsoft.com/office/drawing/2016/5/12/chartex" xmlns:cx7="http://schemas.microsoft.com/office/drawing/2016/5/13/chartex" xmlns:cx8="http://schemas.microsoft.com/office/drawing/2016/5/14/chartex" xmlns:mc="http://schemas.openxmlformats.org/markup-compatibility/2006" xmlns:aink="http://schemas.microsoft.com/office/drawing/2016/ink" xmlns:am3d="http://schemas.microsoft.com/office/drawing/2017/model3d" xmlns:o="urn:schemas-microsoft-com:office:office" xmlns:r="http://schemas.openxmlformats.org/officeDocument/2006/relationships" xmlns:m="http://schemas.openxmlformats.org/officeDocument/2006/math" xmlns:v="urn:schemas-microsoft-com:vml" xmlns:wp14="http://schemas.microsoft.com/office/word/2010/wordprocessingDrawing" xmlns:wp="http://schemas.openxmlformats.org/drawingml/2006/wordprocessingDrawing" xmlns:w10="urn:schemas-microsoft-com:office:word" xmlns:w="http://schemas.openxmlformats.org/wordprocessingml/2006/main" xmlns:w14="http://schemas.microsoft.com/office/word/2010/wordml" xmlns:w15="http://schemas.microsoft.com/office/word/2012/wordml" xmlns:w16cex="http://schemas.microsoft.com/office/word/2018/wordml/cex" xmlns:w16cid="http://schemas.microsoft.com/office/word/2016/wordml/cid" xmlns:w16="http://schemas.microsoft.com/office/word/2018/wordml" xmlns:w16se="http://schemas.microsoft.com/office/word/2015/wordml/symex" xmlns:wpg="http://schemas.microsoft.com/office/word/2010/wordprocessingGroup" xmlns:wpi="http://schemas.microsoft.com/office/word/2010/wordprocessingInk" xmlns:wne="http://schemas.microsoft.com/office/word/2006/wordml" xmlns:wps="http://schemas.microsoft.com/office/word/2010/wordprocessingShape" mc:Ignorable="w14 w15 w16se w16cid w16 w16cex wp14">
-  <w:comment w:id="0" w:author="Author" w:initials="A">
-    <w:p>
-      <w:pPr>
-        <w:pStyle w:val="CommentText"/>
-        <w:spacing w:after="0"/>
-        <w:ind w:left="720"/>
-        <w:jc w:val="both"/>
-        <w:rPr>
-          <w:sz w:val="22"/>
-          <w:szCs w:val="22"/>
-        </w:rPr>
-      </w:pPr>
-      <w:r>
-        <w:rPr>
-          <w:rStyle w:val="CommentReference"/>
-        </w:rPr>
-        <w:annotationRef/>
-      </w:r>
-      <w:bookmarkStart w:id="1" w:name="_Hlk69743083"/>
-      <w:bookmarkStart w:id="2" w:name="_Hlk63262561"/>
-      <w:r>
-        <w:rPr>
-          <w:sz w:val="22"/>
-          <w:szCs w:val="22"/>
-        </w:rPr>
-        <w:t>Abstrak hendaknya memuat :</w:t>
-      </w:r>
-    </w:p>
-    <w:p>
-      <w:pPr>
-        <w:pStyle w:val="CommentText"/>
-        <w:numPr>
-          <w:ilvl w:val="0"/>
-          <w:numId w:val="6"/>
-        </w:numPr>
-        <w:spacing w:after="0"/>
-        <w:ind w:left="1440"/>
-        <w:jc w:val="both"/>
-        <w:rPr>
-          <w:sz w:val="22"/>
-          <w:szCs w:val="22"/>
-        </w:rPr>
-      </w:pPr>
-      <w:r>
-        <w:rPr>
-          <w:sz w:val="22"/>
-          <w:szCs w:val="22"/>
-        </w:rPr>
-        <w:t xml:space="preserve">Permasalahan yang ada </w:t>
-      </w:r>
-    </w:p>
-    <w:p>
-      <w:pPr>
-        <w:pStyle w:val="CommentText"/>
-        <w:numPr>
-          <w:ilvl w:val="0"/>
-          <w:numId w:val="6"/>
-        </w:numPr>
-        <w:spacing w:after="0"/>
-        <w:ind w:left="1440"/>
-        <w:jc w:val="both"/>
-        <w:rPr>
-          <w:sz w:val="22"/>
-          <w:szCs w:val="22"/>
-        </w:rPr>
-      </w:pPr>
-      <w:r>
-        <w:rPr>
-          <w:sz w:val="22"/>
-          <w:szCs w:val="22"/>
-        </w:rPr>
-        <w:t>Jenis dan pendekatan penelitian yang digunakan</w:t>
-      </w:r>
-    </w:p>
-    <w:p>
-      <w:pPr>
-        <w:pStyle w:val="CommentText"/>
-        <w:numPr>
-          <w:ilvl w:val="0"/>
-          <w:numId w:val="6"/>
-        </w:numPr>
-        <w:spacing w:after="0"/>
-        <w:ind w:left="1440"/>
-        <w:jc w:val="both"/>
-        <w:rPr>
-          <w:sz w:val="22"/>
-          <w:szCs w:val="22"/>
-        </w:rPr>
-      </w:pPr>
-      <w:r>
-        <w:rPr>
-          <w:sz w:val="22"/>
-          <w:szCs w:val="22"/>
-        </w:rPr>
-        <w:t>S</w:t>
-      </w:r>
-      <w:r>
-        <w:rPr>
-          <w:sz w:val="22"/>
-          <w:szCs w:val="22"/>
-        </w:rPr>
-        <w:t>impulan, dan implikasi penelitian</w:t>
-      </w:r>
-      <w:bookmarkEnd w:id="1"/>
-      <w:bookmarkEnd w:id="2"/>
-    </w:p>
-  </w:comment>
-  <w:comment w:id="5" w:author="Author" w:initials="A">
-    <w:p>
-      <w:pPr>
-        <w:pStyle w:val="CommentText"/>
-        <w:spacing w:after="0"/>
-        <w:jc w:val="both"/>
-        <w:rPr>
-          <w:sz w:val="22"/>
-          <w:szCs w:val="22"/>
-        </w:rPr>
-      </w:pPr>
-      <w:r>
-        <w:rPr>
-          <w:rStyle w:val="CommentReference"/>
-        </w:rPr>
-        <w:annotationRef/>
-      </w:r>
-      <w:bookmarkStart w:id="6" w:name="_Hlk63350625"/>
-      <w:bookmarkStart w:id="7" w:name="_Hlk66389670"/>
-      <w:bookmarkStart w:id="8" w:name="_Hlk63700674"/>
-      <w:bookmarkStart w:id="9" w:name="_Hlk64315824"/>
-      <w:r>
-        <w:rPr>
-          <w:sz w:val="22"/>
-          <w:szCs w:val="22"/>
-        </w:rPr>
-        <w:t>Pisahkan hasil dan pembahasan</w:t>
-      </w:r>
-      <w:bookmarkEnd w:id="6"/>
-      <w:r>
-        <w:rPr>
-          <w:sz w:val="22"/>
-          <w:szCs w:val="22"/>
-        </w:rPr>
-        <w:t>.</w:t>
-      </w:r>
-    </w:p>
-    <w:p>
-      <w:pPr>
-        <w:pStyle w:val="CommentText"/>
-        <w:spacing w:after="0"/>
-        <w:jc w:val="both"/>
-        <w:rPr>
-          <w:sz w:val="22"/>
-          <w:szCs w:val="22"/>
-        </w:rPr>
-      </w:pPr>
-      <w:bookmarkStart w:id="10" w:name="_Hlk68551666"/>
-      <w:bookmarkStart w:id="11" w:name="_Hlk64317071"/>
-      <w:bookmarkStart w:id="12" w:name="_Hlk64215023"/>
-      <w:bookmarkStart w:id="13" w:name="_Hlk64212826"/>
-      <w:bookmarkStart w:id="14" w:name="_Hlk63891993"/>
-      <w:bookmarkStart w:id="15" w:name="_Hlk64325779"/>
-      <w:bookmarkEnd w:id="7"/>
-      <w:r>
-        <w:rPr>
-          <w:sz w:val="22"/>
-          <w:szCs w:val="22"/>
-        </w:rPr>
-        <w:t xml:space="preserve">Pembahasan menjadi substansi pendukung hasil, yang minimal memuat </w:t>
-      </w:r>
-      <w:bookmarkStart w:id="16" w:name="_Hlk68337666"/>
-      <w:r>
-        <w:rPr>
-          <w:sz w:val="22"/>
-          <w:szCs w:val="22"/>
-        </w:rPr>
-        <w:t xml:space="preserve">komparasi hasil penelitian ini dengan penelitian relevan sebelumnya, jelaskan dengan detail </w:t>
-      </w:r>
-      <w:bookmarkEnd w:id="10"/>
-      <w:r>
-        <w:rPr>
-          <w:sz w:val="22"/>
-          <w:szCs w:val="22"/>
-        </w:rPr>
-        <w:t>alasannya.</w:t>
-      </w:r>
-      <w:bookmarkEnd w:id="16"/>
-      <w:r>
-        <w:rPr>
-          <w:sz w:val="22"/>
-          <w:szCs w:val="22"/>
-        </w:rPr>
-        <w:t xml:space="preserve"> </w:t>
-      </w:r>
-      <w:bookmarkEnd w:id="11"/>
-      <w:r>
-        <w:rPr>
-          <w:sz w:val="22"/>
-          <w:szCs w:val="22"/>
-        </w:rPr>
-        <w:t>Masukkan</w:t>
-      </w:r>
-      <w:r>
-        <w:rPr>
-          <w:sz w:val="22"/>
-          <w:szCs w:val="22"/>
-        </w:rPr>
-        <w:t xml:space="preserve"> tafsiran temuan, dan menggeneralisasikan hasil temuan ke dalam tatanan teori yang sudah mapan</w:t>
-      </w:r>
-      <w:bookmarkEnd w:id="12"/>
-      <w:r>
-        <w:rPr>
-          <w:sz w:val="22"/>
-          <w:szCs w:val="22"/>
-        </w:rPr>
-        <w:t>.</w:t>
-      </w:r>
-    </w:p>
-    <w:bookmarkEnd w:id="8"/>
-    <w:bookmarkEnd w:id="9"/>
-    <w:bookmarkEnd w:id="13"/>
-    <w:bookmarkEnd w:id="14"/>
-    <w:bookmarkEnd w:id="15"/>
-    <w:p>
-      <w:pPr>
-        <w:pStyle w:val="CommentText"/>
-      </w:pPr>
-    </w:p>
-  </w:comment>
-  <w:comment w:id="17" w:author="Author" w:initials="A">
-    <w:p>
-      <w:pPr>
-        <w:pStyle w:val="CommentText"/>
-      </w:pPr>
-      <w:r>
-        <w:rPr>
-          <w:rStyle w:val="CommentReference"/>
-        </w:rPr>
-        <w:annotationRef/>
-      </w:r>
-      <w:r>
-        <w:t>Tekankan pada rangkuman, keterbatasan, dan rekomendasi dari penulis</w:t>
-      </w:r>
-    </w:p>
-  </w:comment>
-</w:comments>
-</file>
-
-<file path=word/commentsExtended.xml><?xml version="1.0" encoding="utf-8"?>
-<w15:commentsEx xmlns:wpc="http://schemas.microsoft.com/office/word/2010/wordprocessingCanvas" xmlns:cx="http://schemas.microsoft.com/office/drawing/2014/chartex" xmlns:cx1="http://schemas.microsoft.com/office/drawing/2015/9/8/chartex" xmlns:cx2="http://schemas.microsoft.com/office/drawing/2015/10/21/chartex" xmlns:cx3="http://schemas.microsoft.com/office/drawing/2016/5/9/chartex" xmlns:cx4="http://schemas.microsoft.com/office/drawing/2016/5/10/chartex" xmlns:cx5="http://schemas.microsoft.com/office/drawing/2016/5/11/chartex" xmlns:cx6="http://schemas.microsoft.com/office/drawing/2016/5/12/chartex" xmlns:cx7="http://schemas.microsoft.com/office/drawing/2016/5/13/chartex" xmlns:cx8="http://schemas.microsoft.com/office/drawing/2016/5/14/chartex" xmlns:mc="http://schemas.openxmlformats.org/markup-compatibility/2006" xmlns:aink="http://schemas.microsoft.com/office/drawing/2016/ink" xmlns:am3d="http://schemas.microsoft.com/office/drawing/2017/model3d" xmlns:o="urn:schemas-microsoft-com:office:office" xmlns:r="http://schemas.openxmlformats.org/officeDocument/2006/relationships" xmlns:m="http://schemas.openxmlformats.org/officeDocument/2006/math" xmlns:v="urn:schemas-microsoft-com:vml" xmlns:wp14="http://schemas.microsoft.com/office/word/2010/wordprocessingDrawing" xmlns:wp="http://schemas.openxmlformats.org/drawingml/2006/wordprocessingDrawing" xmlns:w10="urn:schemas-microsoft-com:office:word" xmlns:w="http://schemas.openxmlformats.org/wordprocessingml/2006/main" xmlns:w14="http://schemas.microsoft.com/office/word/2010/wordml" xmlns:w15="http://schemas.microsoft.com/office/word/2012/wordml" xmlns:w16cex="http://schemas.microsoft.com/office/word/2018/wordml/cex" xmlns:w16cid="http://schemas.microsoft.com/office/word/2016/wordml/cid" xmlns:w16="http://schemas.microsoft.com/office/word/2018/wordml" xmlns:w16se="http://schemas.microsoft.com/office/word/2015/wordml/symex" xmlns:wpg="http://schemas.microsoft.com/office/word/2010/wordprocessingGroup" xmlns:wpi="http://schemas.microsoft.com/office/word/2010/wordprocessingInk" xmlns:wne="http://schemas.microsoft.com/office/word/2006/wordml" xmlns:wps="http://schemas.microsoft.com/office/word/2010/wordprocessingShape" mc:Ignorable="w14 w15 w16se w16cid w16 w16cex wp14">
-  <w15:commentEx w15:paraId="125E9B71" w15:done="0"/>
-  <w15:commentEx w15:paraId="739A5725" w15:done="0"/>
-  <w15:commentEx w15:paraId="2386273B" w15:done="0"/>
-</w15:commentsEx>
-</file>
-
-<file path=word/commentsIds.xml><?xml version="1.0" encoding="utf-8"?>
-<w16cid:commentsIds xmlns:wpc="http://schemas.microsoft.com/office/word/2010/wordprocessingCanvas" xmlns:cx="http://schemas.microsoft.com/office/drawing/2014/chartex" xmlns:cx1="http://schemas.microsoft.com/office/drawing/2015/9/8/chartex" xmlns:cx2="http://schemas.microsoft.com/office/drawing/2015/10/21/chartex" xmlns:cx3="http://schemas.microsoft.com/office/drawing/2016/5/9/chartex" xmlns:cx4="http://schemas.microsoft.com/office/drawing/2016/5/10/chartex" xmlns:cx5="http://schemas.microsoft.com/office/drawing/2016/5/11/chartex" xmlns:cx6="http://schemas.microsoft.com/office/drawing/2016/5/12/chartex" xmlns:cx7="http://schemas.microsoft.com/office/drawing/2016/5/13/chartex" xmlns:cx8="http://schemas.microsoft.com/office/drawing/2016/5/14/chartex" xmlns:mc="http://schemas.openxmlformats.org/markup-compatibility/2006" xmlns:aink="http://schemas.microsoft.com/office/drawing/2016/ink" xmlns:am3d="http://schemas.microsoft.com/office/drawing/2017/model3d" xmlns:o="urn:schemas-microsoft-com:office:office" xmlns:r="http://schemas.openxmlformats.org/officeDocument/2006/relationships" xmlns:m="http://schemas.openxmlformats.org/officeDocument/2006/math" xmlns:v="urn:schemas-microsoft-com:vml" xmlns:wp14="http://schemas.microsoft.com/office/word/2010/wordprocessingDrawing" xmlns:wp="http://schemas.openxmlformats.org/drawingml/2006/wordprocessingDrawing" xmlns:w10="urn:schemas-microsoft-com:office:word" xmlns:w="http://schemas.openxmlformats.org/wordprocessingml/2006/main" xmlns:w14="http://schemas.microsoft.com/office/word/2010/wordml" xmlns:w15="http://schemas.microsoft.com/office/word/2012/wordml" xmlns:w16cex="http://schemas.microsoft.com/office/word/2018/wordml/cex" xmlns:w16cid="http://schemas.microsoft.com/office/word/2016/wordml/cid" xmlns:w16="http://schemas.microsoft.com/office/word/2018/wordml" xmlns:w16se="http://schemas.microsoft.com/office/word/2015/wordml/symex" xmlns:wpg="http://schemas.microsoft.com/office/word/2010/wordprocessingGroup" xmlns:wpi="http://schemas.microsoft.com/office/word/2010/wordprocessingInk" xmlns:wne="http://schemas.microsoft.com/office/word/2006/wordml" xmlns:wps="http://schemas.microsoft.com/office/word/2010/wordprocessingShape" mc:Ignorable="w14 w15 w16se w16cid w16 w16cex wp14">
-  <w16cid:commentId w16cid:paraId="125E9B71" w16cid:durableId="2464A6D7"/>
-  <w16cid:commentId w16cid:paraId="739A5725" w16cid:durableId="2464A5D5"/>
-  <w16cid:commentId w16cid:paraId="2386273B" w16cid:durableId="2464A58C"/>
-</w16cid:commentsIds>
 </file>
 
 <file path=word/endnotes.xml><?xml version="1.0" encoding="utf-8"?>

</xml_diff>